<commit_message>
tambah Postman collection, screenshot hasil pengujian, dan harness uji lokal
</commit_message>
<xml_diff>
--- a/Laporan_Tugas1_2428240094_Fellisa_Anastasya.docx
+++ b/Laporan_Tugas1_2428240094_Fellisa_Anastasya.docx
@@ -382,6 +382,9 @@
         <w:gridCol w:w="5600"/>
       </w:tblGrid>
       <w:tr>
+        <w:trPr>
+          <w:tblHeader/>
+        </w:trPr>
         <w:tc>
           <w:tcPr>
             <w:tcW w:w="2551" w:type="dxa"/>
@@ -395,6 +398,10 @@
             <w:vAlign w:val="center"/>
           </w:tcPr>
           <w:p>
+            <w:pPr>
+              <w:keepNext/>
+              <w:spacing w:line="240" w:lineRule="auto" w:after="0" w:before="0"/>
+            </w:pPr>
             <w:r>
               <w:rPr>
                 <w:b/>
@@ -429,6 +436,10 @@
             <w:vAlign w:val="center"/>
           </w:tcPr>
           <w:p>
+            <w:pPr>
+              <w:keepNext/>
+              <w:spacing w:line="240" w:lineRule="auto" w:after="0" w:before="0"/>
+            </w:pPr>
             <w:r>
               <w:t>Fellisa Anastasya</w:t>
             </w:r>
@@ -449,6 +460,10 @@
             <w:vAlign w:val="center"/>
           </w:tcPr>
           <w:p>
+            <w:pPr>
+              <w:keepNext/>
+              <w:spacing w:line="240" w:lineRule="auto" w:after="0" w:before="0"/>
+            </w:pPr>
             <w:r>
               <w:rPr>
                 <w:b/>
@@ -481,6 +496,10 @@
             <w:vAlign w:val="center"/>
           </w:tcPr>
           <w:p>
+            <w:pPr>
+              <w:keepNext/>
+              <w:spacing w:line="240" w:lineRule="auto" w:after="0" w:before="0"/>
+            </w:pPr>
             <w:r>
               <w:t>2428240094</w:t>
             </w:r>
@@ -501,6 +520,10 @@
             <w:vAlign w:val="center"/>
           </w:tcPr>
           <w:p>
+            <w:pPr>
+              <w:keepNext/>
+              <w:spacing w:line="240" w:lineRule="auto" w:after="0" w:before="0"/>
+            </w:pPr>
             <w:proofErr w:type="spellStart"/>
             <w:r>
               <w:rPr>
@@ -526,6 +549,10 @@
             <w:vAlign w:val="center"/>
           </w:tcPr>
           <w:p>
+            <w:pPr>
+              <w:keepNext/>
+              <w:spacing w:line="240" w:lineRule="auto" w:after="0" w:before="0"/>
+            </w:pPr>
             <w:r>
               <w:t>SI5B</w:t>
             </w:r>
@@ -546,6 +573,10 @@
             <w:vAlign w:val="center"/>
           </w:tcPr>
           <w:p>
+            <w:pPr>
+              <w:keepNext/>
+              <w:spacing w:line="240" w:lineRule="auto" w:after="0" w:before="0"/>
+            </w:pPr>
             <w:proofErr w:type="spellStart"/>
             <w:r>
               <w:rPr>
@@ -580,6 +611,10 @@
             <w:vAlign w:val="center"/>
           </w:tcPr>
           <w:p>
+            <w:pPr>
+              <w:keepNext/>
+              <w:spacing w:line="240" w:lineRule="auto" w:after="0" w:before="0"/>
+            </w:pPr>
             <w:r>
               <w:t>1</w:t>
             </w:r>
@@ -600,6 +635,10 @@
             <w:vAlign w:val="center"/>
           </w:tcPr>
           <w:p>
+            <w:pPr>
+              <w:keepNext/>
+              <w:spacing w:line="240" w:lineRule="auto" w:after="0" w:before="0"/>
+            </w:pPr>
             <w:proofErr w:type="spellStart"/>
             <w:r>
               <w:rPr>
@@ -665,6 +704,10 @@
             <w:vAlign w:val="center"/>
           </w:tcPr>
           <w:p>
+            <w:pPr>
+              <w:keepNext/>
+              <w:spacing w:line="240" w:lineRule="auto" w:after="0" w:before="0"/>
+            </w:pPr>
             <w:r>
               <w:t>Tugas 1: RESTful API Murni dengan Express.js - Toko Gadget: Smartphone (Topik 26)</w:t>
             </w:r>
@@ -685,6 +728,10 @@
             <w:vAlign w:val="center"/>
           </w:tcPr>
           <w:p>
+            <w:pPr>
+              <w:keepNext/>
+              <w:spacing w:line="240" w:lineRule="auto" w:after="0" w:before="0"/>
+            </w:pPr>
             <w:proofErr w:type="spellStart"/>
             <w:r>
               <w:rPr>
@@ -730,6 +777,10 @@
             <w:vAlign w:val="center"/>
           </w:tcPr>
           <w:p>
+            <w:pPr>
+              <w:keepNext/>
+              <w:spacing w:line="240" w:lineRule="auto" w:after="0" w:before="0"/>
+            </w:pPr>
             <w:r>
               <w:t>4 Oktober 2026</w:t>
             </w:r>
@@ -750,6 +801,9 @@
             <w:vAlign w:val="center"/>
           </w:tcPr>
           <w:p>
+            <w:pPr>
+              <w:spacing w:line="240" w:lineRule="auto" w:after="0" w:before="0"/>
+            </w:pPr>
             <w:r>
               <w:rPr>
                 <w:b/>
@@ -784,6 +838,9 @@
             <w:vAlign w:val="center"/>
           </w:tcPr>
           <w:p>
+            <w:pPr>
+              <w:spacing w:line="240" w:lineRule="auto" w:after="0" w:before="0"/>
+            </w:pPr>
             <w:r>
               <w:t>……………………………………….</w:t>
             </w:r>
@@ -1063,6 +1120,7 @@
     <w:p>
       <w:pPr>
         <w:pStyle w:val="Heading1"/>
+        <w:pageBreakBefore/>
         <w:spacing w:before="320" w:after="160"/>
         <w:rPr>
           <w:lang w:val="sv-SE"/>
@@ -1126,6 +1184,9 @@
         <w:gridCol w:w="4200"/>
       </w:tblGrid>
       <w:tr>
+        <w:trPr>
+          <w:tblHeader/>
+        </w:trPr>
         <w:tc>
           <w:tcPr>
             <w:tcW w:w="850" w:type="dxa"/>
@@ -1139,6 +1200,10 @@
             <w:vAlign w:val="center"/>
           </w:tcPr>
           <w:p>
+            <w:pPr>
+              <w:keepNext/>
+              <w:spacing w:line="240" w:lineRule="auto" w:after="0" w:before="0"/>
+            </w:pPr>
             <w:r>
               <w:rPr>
                 <w:b/>
@@ -1164,6 +1229,10 @@
             <w:vAlign w:val="center"/>
           </w:tcPr>
           <w:p>
+            <w:pPr>
+              <w:keepNext/>
+              <w:spacing w:line="240" w:lineRule="auto" w:after="0" w:before="0"/>
+            </w:pPr>
             <w:r>
               <w:rPr>
                 <w:b/>
@@ -1189,6 +1258,10 @@
             <w:vAlign w:val="center"/>
           </w:tcPr>
           <w:p>
+            <w:pPr>
+              <w:keepNext/>
+              <w:spacing w:line="240" w:lineRule="auto" w:after="0" w:before="0"/>
+            </w:pPr>
             <w:proofErr w:type="spellStart"/>
             <w:r>
               <w:rPr>
@@ -1239,6 +1312,10 @@
             <w:vAlign w:val="center"/>
           </w:tcPr>
           <w:p>
+            <w:pPr>
+              <w:keepNext/>
+              <w:spacing w:line="240" w:lineRule="auto" w:after="0" w:before="0"/>
+            </w:pPr>
             <w:r>
               <w:rPr>
                 <w:sz w:val="21"/>
@@ -1259,6 +1336,10 @@
             <w:vAlign w:val="center"/>
           </w:tcPr>
           <w:p>
+            <w:pPr>
+              <w:keepNext/>
+              <w:spacing w:line="240" w:lineRule="auto" w:after="0" w:before="0"/>
+            </w:pPr>
             <w:r>
               <w:rPr>
                 <w:sz w:val="21"/>
@@ -1279,6 +1360,10 @@
             <w:vAlign w:val="center"/>
           </w:tcPr>
           <w:p>
+            <w:pPr>
+              <w:keepNext/>
+              <w:spacing w:line="240" w:lineRule="auto" w:after="0" w:before="0"/>
+            </w:pPr>
             <w:r>
               <w:t>v26.7.0 (LTS) - runtime server-side</w:t>
             </w:r>
@@ -1298,6 +1383,10 @@
             <w:vAlign w:val="center"/>
           </w:tcPr>
           <w:p>
+            <w:pPr>
+              <w:keepNext/>
+              <w:spacing w:line="240" w:lineRule="auto" w:after="0" w:before="0"/>
+            </w:pPr>
             <w:r>
               <w:rPr>
                 <w:sz w:val="21"/>
@@ -1318,6 +1407,10 @@
             <w:vAlign w:val="center"/>
           </w:tcPr>
           <w:p>
+            <w:pPr>
+              <w:keepNext/>
+              <w:spacing w:line="240" w:lineRule="auto" w:after="0" w:before="0"/>
+            </w:pPr>
             <w:r>
               <w:rPr>
                 <w:sz w:val="21"/>
@@ -1338,6 +1431,10 @@
             <w:vAlign w:val="center"/>
           </w:tcPr>
           <w:p>
+            <w:pPr>
+              <w:keepNext/>
+              <w:spacing w:line="240" w:lineRule="auto" w:after="0" w:before="0"/>
+            </w:pPr>
             <w:r>
               <w:t>Editor teks untuk menulis app.js</w:t>
             </w:r>
@@ -1357,6 +1454,10 @@
             <w:vAlign w:val="center"/>
           </w:tcPr>
           <w:p>
+            <w:pPr>
+              <w:keepNext/>
+              <w:spacing w:line="240" w:lineRule="auto" w:after="0" w:before="0"/>
+            </w:pPr>
             <w:r>
               <w:rPr>
                 <w:sz w:val="21"/>
@@ -1377,6 +1478,10 @@
             <w:vAlign w:val="center"/>
           </w:tcPr>
           <w:p>
+            <w:pPr>
+              <w:keepNext/>
+              <w:spacing w:line="240" w:lineRule="auto" w:after="0" w:before="0"/>
+            </w:pPr>
             <w:r>
               <w:t>npm</w:t>
             </w:r>
@@ -1394,6 +1499,10 @@
             <w:vAlign w:val="center"/>
           </w:tcPr>
           <w:p>
+            <w:pPr>
+              <w:keepNext/>
+              <w:spacing w:line="240" w:lineRule="auto" w:after="0" w:before="0"/>
+            </w:pPr>
             <w:r>
               <w:t>v11.19.0 - package manager</w:t>
             </w:r>
@@ -1413,6 +1522,10 @@
             <w:vAlign w:val="center"/>
           </w:tcPr>
           <w:p>
+            <w:pPr>
+              <w:keepNext/>
+              <w:spacing w:line="240" w:lineRule="auto" w:after="0" w:before="0"/>
+            </w:pPr>
             <w:r>
               <w:rPr>
                 <w:sz w:val="21"/>
@@ -1433,6 +1546,10 @@
             <w:vAlign w:val="center"/>
           </w:tcPr>
           <w:p>
+            <w:pPr>
+              <w:keepNext/>
+              <w:spacing w:line="240" w:lineRule="auto" w:after="0" w:before="0"/>
+            </w:pPr>
             <w:r>
               <w:t>Express.js</w:t>
             </w:r>
@@ -1450,6 +1567,10 @@
             <w:vAlign w:val="center"/>
           </w:tcPr>
           <w:p>
+            <w:pPr>
+              <w:keepNext/>
+              <w:spacing w:line="240" w:lineRule="auto" w:after="0" w:before="0"/>
+            </w:pPr>
             <w:r>
               <w:t>v4.19.2 - framework RESTful API (dependency)</w:t>
             </w:r>
@@ -1462,6 +1583,10 @@
             <w:tcW w:type="dxa" w:w="850"/>
           </w:tcPr>
           <w:p>
+            <w:pPr>
+              <w:keepNext/>
+              <w:spacing w:line="240" w:lineRule="auto" w:after="0" w:before="0"/>
+            </w:pPr>
             <w:r>
               <w:t>5</w:t>
             </w:r>
@@ -1472,6 +1597,10 @@
             <w:tcW w:type="dxa" w:w="3118"/>
           </w:tcPr>
           <w:p>
+            <w:pPr>
+              <w:keepNext/>
+              <w:spacing w:line="240" w:lineRule="auto" w:after="0" w:before="0"/>
+            </w:pPr>
             <w:r>
               <w:rPr>
                 <w:b w:val="0"/>
@@ -1485,6 +1614,10 @@
             <w:tcW w:type="dxa" w:w="3969"/>
           </w:tcPr>
           <w:p>
+            <w:pPr>
+              <w:keepNext/>
+              <w:spacing w:line="240" w:lineRule="auto" w:after="0" w:before="0"/>
+            </w:pPr>
             <w:r>
               <w:rPr>
                 <w:b w:val="0"/>
@@ -1500,6 +1633,10 @@
             <w:tcW w:type="dxa" w:w="850"/>
           </w:tcPr>
           <w:p>
+            <w:pPr>
+              <w:keepNext/>
+              <w:spacing w:line="240" w:lineRule="auto" w:after="0" w:before="0"/>
+            </w:pPr>
             <w:r>
               <w:t>6</w:t>
             </w:r>
@@ -1510,6 +1647,10 @@
             <w:tcW w:type="dxa" w:w="3118"/>
           </w:tcPr>
           <w:p>
+            <w:pPr>
+              <w:keepNext/>
+              <w:spacing w:line="240" w:lineRule="auto" w:after="0" w:before="0"/>
+            </w:pPr>
             <w:r>
               <w:rPr>
                 <w:b w:val="0"/>
@@ -1523,6 +1664,10 @@
             <w:tcW w:type="dxa" w:w="3969"/>
           </w:tcPr>
           <w:p>
+            <w:pPr>
+              <w:keepNext/>
+              <w:spacing w:line="240" w:lineRule="auto" w:after="0" w:before="0"/>
+            </w:pPr>
             <w:r>
               <w:rPr>
                 <w:b w:val="0"/>
@@ -1538,6 +1683,10 @@
             <w:tcW w:type="dxa" w:w="850"/>
           </w:tcPr>
           <w:p>
+            <w:pPr>
+              <w:keepNext/>
+              <w:spacing w:line="240" w:lineRule="auto" w:after="0" w:before="0"/>
+            </w:pPr>
             <w:r>
               <w:t>7</w:t>
             </w:r>
@@ -1548,6 +1697,10 @@
             <w:tcW w:type="dxa" w:w="3118"/>
           </w:tcPr>
           <w:p>
+            <w:pPr>
+              <w:keepNext/>
+              <w:spacing w:line="240" w:lineRule="auto" w:after="0" w:before="0"/>
+            </w:pPr>
             <w:r>
               <w:rPr>
                 <w:b w:val="0"/>
@@ -1561,6 +1714,10 @@
             <w:tcW w:type="dxa" w:w="3969"/>
           </w:tcPr>
           <w:p>
+            <w:pPr>
+              <w:keepNext/>
+              <w:spacing w:line="240" w:lineRule="auto" w:after="0" w:before="0"/>
+            </w:pPr>
             <w:r>
               <w:rPr>
                 <w:b w:val="0"/>
@@ -1576,6 +1733,10 @@
             <w:tcW w:type="dxa" w:w="850"/>
           </w:tcPr>
           <w:p>
+            <w:pPr>
+              <w:keepNext/>
+              <w:spacing w:line="240" w:lineRule="auto" w:after="0" w:before="0"/>
+            </w:pPr>
             <w:r>
               <w:t>8</w:t>
             </w:r>
@@ -1586,6 +1747,10 @@
             <w:tcW w:type="dxa" w:w="3118"/>
           </w:tcPr>
           <w:p>
+            <w:pPr>
+              <w:keepNext/>
+              <w:spacing w:line="240" w:lineRule="auto" w:after="0" w:before="0"/>
+            </w:pPr>
             <w:r>
               <w:rPr>
                 <w:b w:val="0"/>
@@ -1599,6 +1764,10 @@
             <w:tcW w:type="dxa" w:w="3969"/>
           </w:tcPr>
           <w:p>
+            <w:pPr>
+              <w:keepNext/>
+              <w:spacing w:line="240" w:lineRule="auto" w:after="0" w:before="0"/>
+            </w:pPr>
             <w:r>
               <w:rPr>
                 <w:b w:val="0"/>
@@ -1614,6 +1783,9 @@
             <w:tcW w:type="dxa" w:w="850"/>
           </w:tcPr>
           <w:p>
+            <w:pPr>
+              <w:spacing w:line="240" w:lineRule="auto" w:after="0" w:before="0"/>
+            </w:pPr>
             <w:r>
               <w:t>9</w:t>
             </w:r>
@@ -1624,6 +1796,9 @@
             <w:tcW w:type="dxa" w:w="3118"/>
           </w:tcPr>
           <w:p>
+            <w:pPr>
+              <w:spacing w:line="240" w:lineRule="auto" w:after="0" w:before="0"/>
+            </w:pPr>
             <w:r>
               <w:rPr>
                 <w:b w:val="0"/>
@@ -1637,6 +1812,9 @@
             <w:tcW w:type="dxa" w:w="3969"/>
           </w:tcPr>
           <w:p>
+            <w:pPr>
+              <w:spacing w:line="240" w:lineRule="auto" w:after="0" w:before="0"/>
+            </w:pPr>
             <w:r>
               <w:rPr>
                 <w:b w:val="0"/>
@@ -2907,6 +3085,7 @@
     <w:p>
       <w:pPr>
         <w:pStyle w:val="Heading1"/>
+        <w:pageBreakBefore/>
         <w:spacing w:before="320" w:after="160"/>
         <w:rPr>
           <w:lang w:val="sv-SE"/>
@@ -3282,11 +3461,17 @@
         <w:gridCol w:w="1323"/>
       </w:tblGrid>
       <w:tr>
+        <w:trPr>
+          <w:tblHeader/>
+        </w:trPr>
         <w:tc>
           <w:tcPr>
             <w:tcW w:type="dxa" w:w="510"/>
           </w:tcPr>
           <w:p>
+            <w:pPr>
+              <w:spacing w:line="240" w:lineRule="auto" w:after="0" w:before="0"/>
+            </w:pPr>
             <w:r>
               <w:rPr>
                 <w:b/>
@@ -3300,6 +3485,9 @@
             <w:tcW w:type="dxa" w:w="964"/>
           </w:tcPr>
           <w:p>
+            <w:pPr>
+              <w:spacing w:line="240" w:lineRule="auto" w:after="0" w:before="0"/>
+            </w:pPr>
             <w:r>
               <w:rPr>
                 <w:b/>
@@ -3313,6 +3501,9 @@
             <w:tcW w:type="dxa" w:w="2268"/>
           </w:tcPr>
           <w:p>
+            <w:pPr>
+              <w:spacing w:line="240" w:lineRule="auto" w:after="0" w:before="0"/>
+            </w:pPr>
             <w:r>
               <w:rPr>
                 <w:b/>
@@ -3326,6 +3517,9 @@
             <w:tcW w:type="dxa" w:w="1077"/>
           </w:tcPr>
           <w:p>
+            <w:pPr>
+              <w:spacing w:line="240" w:lineRule="auto" w:after="0" w:before="0"/>
+            </w:pPr>
             <w:r>
               <w:rPr>
                 <w:b/>
@@ -3339,6 +3533,9 @@
             <w:tcW w:type="dxa" w:w="907"/>
           </w:tcPr>
           <w:p>
+            <w:pPr>
+              <w:spacing w:line="240" w:lineRule="auto" w:after="0" w:before="0"/>
+            </w:pPr>
             <w:r>
               <w:rPr>
                 <w:b/>
@@ -3352,6 +3549,9 @@
             <w:tcW w:type="dxa" w:w="2211"/>
           </w:tcPr>
           <w:p>
+            <w:pPr>
+              <w:spacing w:line="240" w:lineRule="auto" w:after="0" w:before="0"/>
+            </w:pPr>
             <w:r>
               <w:rPr>
                 <w:b/>
@@ -3367,6 +3567,9 @@
             <w:tcW w:type="dxa" w:w="510"/>
           </w:tcPr>
           <w:p>
+            <w:pPr>
+              <w:spacing w:line="240" w:lineRule="auto" w:after="0" w:before="0"/>
+            </w:pPr>
             <w:r>
               <w:rPr>
                 <w:b w:val="0"/>
@@ -3380,6 +3583,9 @@
             <w:tcW w:type="dxa" w:w="964"/>
           </w:tcPr>
           <w:p>
+            <w:pPr>
+              <w:spacing w:line="240" w:lineRule="auto" w:after="0" w:before="0"/>
+            </w:pPr>
             <w:r>
               <w:rPr>
                 <w:b w:val="0"/>
@@ -3393,6 +3599,9 @@
             <w:tcW w:type="dxa" w:w="2268"/>
           </w:tcPr>
           <w:p>
+            <w:pPr>
+              <w:spacing w:line="240" w:lineRule="auto" w:after="0" w:before="0"/>
+            </w:pPr>
             <w:r>
               <w:rPr>
                 <w:b w:val="0"/>
@@ -3406,6 +3615,9 @@
             <w:tcW w:type="dxa" w:w="1077"/>
           </w:tcPr>
           <w:p>
+            <w:pPr>
+              <w:spacing w:line="240" w:lineRule="auto" w:after="0" w:before="0"/>
+            </w:pPr>
             <w:r>
               <w:rPr>
                 <w:b w:val="0"/>
@@ -3419,6 +3631,9 @@
             <w:tcW w:type="dxa" w:w="907"/>
           </w:tcPr>
           <w:p>
+            <w:pPr>
+              <w:spacing w:line="240" w:lineRule="auto" w:after="0" w:before="0"/>
+            </w:pPr>
             <w:r>
               <w:rPr>
                 <w:b w:val="0"/>
@@ -3432,6 +3647,9 @@
             <w:tcW w:type="dxa" w:w="2211"/>
           </w:tcPr>
           <w:p>
+            <w:pPr>
+              <w:spacing w:line="240" w:lineRule="auto" w:after="0" w:before="0"/>
+            </w:pPr>
             <w:r>
               <w:rPr>
                 <w:b w:val="0"/>
@@ -3447,6 +3665,9 @@
             <w:tcW w:type="dxa" w:w="510"/>
           </w:tcPr>
           <w:p>
+            <w:pPr>
+              <w:spacing w:line="240" w:lineRule="auto" w:after="0" w:before="0"/>
+            </w:pPr>
             <w:r>
               <w:rPr>
                 <w:b w:val="0"/>
@@ -3460,6 +3681,9 @@
             <w:tcW w:type="dxa" w:w="964"/>
           </w:tcPr>
           <w:p>
+            <w:pPr>
+              <w:spacing w:line="240" w:lineRule="auto" w:after="0" w:before="0"/>
+            </w:pPr>
             <w:r>
               <w:rPr>
                 <w:b w:val="0"/>
@@ -3473,6 +3697,9 @@
             <w:tcW w:type="dxa" w:w="2268"/>
           </w:tcPr>
           <w:p>
+            <w:pPr>
+              <w:spacing w:line="240" w:lineRule="auto" w:after="0" w:before="0"/>
+            </w:pPr>
             <w:r>
               <w:rPr>
                 <w:b w:val="0"/>
@@ -3486,6 +3713,9 @@
             <w:tcW w:type="dxa" w:w="1077"/>
           </w:tcPr>
           <w:p>
+            <w:pPr>
+              <w:spacing w:line="240" w:lineRule="auto" w:after="0" w:before="0"/>
+            </w:pPr>
             <w:r>
               <w:rPr>
                 <w:b w:val="0"/>
@@ -3499,6 +3729,9 @@
             <w:tcW w:type="dxa" w:w="907"/>
           </w:tcPr>
           <w:p>
+            <w:pPr>
+              <w:spacing w:line="240" w:lineRule="auto" w:after="0" w:before="0"/>
+            </w:pPr>
             <w:r>
               <w:rPr>
                 <w:b w:val="0"/>
@@ -3512,6 +3745,9 @@
             <w:tcW w:type="dxa" w:w="2211"/>
           </w:tcPr>
           <w:p>
+            <w:pPr>
+              <w:spacing w:line="240" w:lineRule="auto" w:after="0" w:before="0"/>
+            </w:pPr>
             <w:r>
               <w:rPr>
                 <w:b w:val="0"/>
@@ -3527,6 +3763,9 @@
             <w:tcW w:type="dxa" w:w="510"/>
           </w:tcPr>
           <w:p>
+            <w:pPr>
+              <w:spacing w:line="240" w:lineRule="auto" w:after="0" w:before="0"/>
+            </w:pPr>
             <w:r>
               <w:rPr>
                 <w:b w:val="0"/>
@@ -3540,6 +3779,9 @@
             <w:tcW w:type="dxa" w:w="964"/>
           </w:tcPr>
           <w:p>
+            <w:pPr>
+              <w:spacing w:line="240" w:lineRule="auto" w:after="0" w:before="0"/>
+            </w:pPr>
             <w:r>
               <w:rPr>
                 <w:b w:val="0"/>
@@ -3553,6 +3795,9 @@
             <w:tcW w:type="dxa" w:w="2268"/>
           </w:tcPr>
           <w:p>
+            <w:pPr>
+              <w:spacing w:line="240" w:lineRule="auto" w:after="0" w:before="0"/>
+            </w:pPr>
             <w:r>
               <w:rPr>
                 <w:b w:val="0"/>
@@ -3566,6 +3811,9 @@
             <w:tcW w:type="dxa" w:w="1077"/>
           </w:tcPr>
           <w:p>
+            <w:pPr>
+              <w:spacing w:line="240" w:lineRule="auto" w:after="0" w:before="0"/>
+            </w:pPr>
             <w:r>
               <w:rPr>
                 <w:b w:val="0"/>
@@ -3579,6 +3827,9 @@
             <w:tcW w:type="dxa" w:w="907"/>
           </w:tcPr>
           <w:p>
+            <w:pPr>
+              <w:spacing w:line="240" w:lineRule="auto" w:after="0" w:before="0"/>
+            </w:pPr>
             <w:r>
               <w:rPr>
                 <w:b w:val="0"/>
@@ -3592,6 +3843,9 @@
             <w:tcW w:type="dxa" w:w="2211"/>
           </w:tcPr>
           <w:p>
+            <w:pPr>
+              <w:spacing w:line="240" w:lineRule="auto" w:after="0" w:before="0"/>
+            </w:pPr>
             <w:r>
               <w:rPr>
                 <w:b w:val="0"/>
@@ -3607,6 +3861,9 @@
             <w:tcW w:type="dxa" w:w="510"/>
           </w:tcPr>
           <w:p>
+            <w:pPr>
+              <w:spacing w:line="240" w:lineRule="auto" w:after="0" w:before="0"/>
+            </w:pPr>
             <w:r>
               <w:rPr>
                 <w:b w:val="0"/>
@@ -3620,6 +3877,9 @@
             <w:tcW w:type="dxa" w:w="964"/>
           </w:tcPr>
           <w:p>
+            <w:pPr>
+              <w:spacing w:line="240" w:lineRule="auto" w:after="0" w:before="0"/>
+            </w:pPr>
             <w:r>
               <w:rPr>
                 <w:b w:val="0"/>
@@ -3633,6 +3893,9 @@
             <w:tcW w:type="dxa" w:w="2268"/>
           </w:tcPr>
           <w:p>
+            <w:pPr>
+              <w:spacing w:line="240" w:lineRule="auto" w:after="0" w:before="0"/>
+            </w:pPr>
             <w:r>
               <w:rPr>
                 <w:b w:val="0"/>
@@ -3646,6 +3909,9 @@
             <w:tcW w:type="dxa" w:w="1077"/>
           </w:tcPr>
           <w:p>
+            <w:pPr>
+              <w:spacing w:line="240" w:lineRule="auto" w:after="0" w:before="0"/>
+            </w:pPr>
             <w:r>
               <w:rPr>
                 <w:b w:val="0"/>
@@ -3659,6 +3925,9 @@
             <w:tcW w:type="dxa" w:w="907"/>
           </w:tcPr>
           <w:p>
+            <w:pPr>
+              <w:spacing w:line="240" w:lineRule="auto" w:after="0" w:before="0"/>
+            </w:pPr>
             <w:r>
               <w:rPr>
                 <w:b w:val="0"/>
@@ -3672,6 +3941,9 @@
             <w:tcW w:type="dxa" w:w="2211"/>
           </w:tcPr>
           <w:p>
+            <w:pPr>
+              <w:spacing w:line="240" w:lineRule="auto" w:after="0" w:before="0"/>
+            </w:pPr>
             <w:r>
               <w:rPr>
                 <w:b w:val="0"/>
@@ -3687,6 +3959,9 @@
             <w:tcW w:type="dxa" w:w="510"/>
           </w:tcPr>
           <w:p>
+            <w:pPr>
+              <w:spacing w:line="240" w:lineRule="auto" w:after="0" w:before="0"/>
+            </w:pPr>
             <w:r>
               <w:rPr>
                 <w:b w:val="0"/>
@@ -3700,6 +3975,9 @@
             <w:tcW w:type="dxa" w:w="964"/>
           </w:tcPr>
           <w:p>
+            <w:pPr>
+              <w:spacing w:line="240" w:lineRule="auto" w:after="0" w:before="0"/>
+            </w:pPr>
             <w:r>
               <w:rPr>
                 <w:b w:val="0"/>
@@ -3713,6 +3991,9 @@
             <w:tcW w:type="dxa" w:w="2268"/>
           </w:tcPr>
           <w:p>
+            <w:pPr>
+              <w:spacing w:line="240" w:lineRule="auto" w:after="0" w:before="0"/>
+            </w:pPr>
             <w:r>
               <w:rPr>
                 <w:b w:val="0"/>
@@ -3726,6 +4007,9 @@
             <w:tcW w:type="dxa" w:w="1077"/>
           </w:tcPr>
           <w:p>
+            <w:pPr>
+              <w:spacing w:line="240" w:lineRule="auto" w:after="0" w:before="0"/>
+            </w:pPr>
             <w:r>
               <w:rPr>
                 <w:b w:val="0"/>
@@ -3739,6 +4023,9 @@
             <w:tcW w:type="dxa" w:w="907"/>
           </w:tcPr>
           <w:p>
+            <w:pPr>
+              <w:spacing w:line="240" w:lineRule="auto" w:after="0" w:before="0"/>
+            </w:pPr>
             <w:r>
               <w:rPr>
                 <w:b w:val="0"/>
@@ -3752,6 +4039,9 @@
             <w:tcW w:type="dxa" w:w="2211"/>
           </w:tcPr>
           <w:p>
+            <w:pPr>
+              <w:spacing w:line="240" w:lineRule="auto" w:after="0" w:before="0"/>
+            </w:pPr>
             <w:r>
               <w:rPr>
                 <w:b w:val="0"/>
@@ -3767,6 +4057,9 @@
             <w:tcW w:type="dxa" w:w="510"/>
           </w:tcPr>
           <w:p>
+            <w:pPr>
+              <w:spacing w:line="240" w:lineRule="auto" w:after="0" w:before="0"/>
+            </w:pPr>
             <w:r>
               <w:rPr>
                 <w:b w:val="0"/>
@@ -3780,6 +4073,9 @@
             <w:tcW w:type="dxa" w:w="964"/>
           </w:tcPr>
           <w:p>
+            <w:pPr>
+              <w:spacing w:line="240" w:lineRule="auto" w:after="0" w:before="0"/>
+            </w:pPr>
             <w:r>
               <w:rPr>
                 <w:b w:val="0"/>
@@ -3793,6 +4089,9 @@
             <w:tcW w:type="dxa" w:w="2268"/>
           </w:tcPr>
           <w:p>
+            <w:pPr>
+              <w:spacing w:line="240" w:lineRule="auto" w:after="0" w:before="0"/>
+            </w:pPr>
             <w:r>
               <w:rPr>
                 <w:b w:val="0"/>
@@ -3806,6 +4105,9 @@
             <w:tcW w:type="dxa" w:w="1077"/>
           </w:tcPr>
           <w:p>
+            <w:pPr>
+              <w:spacing w:line="240" w:lineRule="auto" w:after="0" w:before="0"/>
+            </w:pPr>
             <w:r>
               <w:rPr>
                 <w:b w:val="0"/>
@@ -3819,6 +4121,9 @@
             <w:tcW w:type="dxa" w:w="907"/>
           </w:tcPr>
           <w:p>
+            <w:pPr>
+              <w:spacing w:line="240" w:lineRule="auto" w:after="0" w:before="0"/>
+            </w:pPr>
             <w:r>
               <w:rPr>
                 <w:b w:val="0"/>
@@ -3832,6 +4137,9 @@
             <w:tcW w:type="dxa" w:w="2211"/>
           </w:tcPr>
           <w:p>
+            <w:pPr>
+              <w:spacing w:line="240" w:lineRule="auto" w:after="0" w:before="0"/>
+            </w:pPr>
             <w:r>
               <w:rPr>
                 <w:b w:val="0"/>
@@ -3847,6 +4155,9 @@
             <w:tcW w:type="dxa" w:w="510"/>
           </w:tcPr>
           <w:p>
+            <w:pPr>
+              <w:spacing w:line="240" w:lineRule="auto" w:after="0" w:before="0"/>
+            </w:pPr>
             <w:r>
               <w:rPr>
                 <w:b w:val="0"/>
@@ -3860,6 +4171,9 @@
             <w:tcW w:type="dxa" w:w="964"/>
           </w:tcPr>
           <w:p>
+            <w:pPr>
+              <w:spacing w:line="240" w:lineRule="auto" w:after="0" w:before="0"/>
+            </w:pPr>
             <w:r>
               <w:rPr>
                 <w:b w:val="0"/>
@@ -3873,6 +4187,9 @@
             <w:tcW w:type="dxa" w:w="2268"/>
           </w:tcPr>
           <w:p>
+            <w:pPr>
+              <w:spacing w:line="240" w:lineRule="auto" w:after="0" w:before="0"/>
+            </w:pPr>
             <w:r>
               <w:rPr>
                 <w:b w:val="0"/>
@@ -3886,6 +4203,9 @@
             <w:tcW w:type="dxa" w:w="1077"/>
           </w:tcPr>
           <w:p>
+            <w:pPr>
+              <w:spacing w:line="240" w:lineRule="auto" w:after="0" w:before="0"/>
+            </w:pPr>
             <w:r>
               <w:rPr>
                 <w:b w:val="0"/>
@@ -3899,6 +4219,9 @@
             <w:tcW w:type="dxa" w:w="907"/>
           </w:tcPr>
           <w:p>
+            <w:pPr>
+              <w:spacing w:line="240" w:lineRule="auto" w:after="0" w:before="0"/>
+            </w:pPr>
             <w:r>
               <w:rPr>
                 <w:b w:val="0"/>
@@ -3912,6 +4235,9 @@
             <w:tcW w:type="dxa" w:w="2211"/>
           </w:tcPr>
           <w:p>
+            <w:pPr>
+              <w:spacing w:line="240" w:lineRule="auto" w:after="0" w:before="0"/>
+            </w:pPr>
             <w:r>
               <w:rPr>
                 <w:b w:val="0"/>
@@ -3927,6 +4253,9 @@
             <w:tcW w:type="dxa" w:w="510"/>
           </w:tcPr>
           <w:p>
+            <w:pPr>
+              <w:spacing w:line="240" w:lineRule="auto" w:after="0" w:before="0"/>
+            </w:pPr>
             <w:r>
               <w:rPr>
                 <w:b w:val="0"/>
@@ -3940,6 +4269,9 @@
             <w:tcW w:type="dxa" w:w="964"/>
           </w:tcPr>
           <w:p>
+            <w:pPr>
+              <w:spacing w:line="240" w:lineRule="auto" w:after="0" w:before="0"/>
+            </w:pPr>
             <w:r>
               <w:rPr>
                 <w:b w:val="0"/>
@@ -3953,6 +4285,9 @@
             <w:tcW w:type="dxa" w:w="2268"/>
           </w:tcPr>
           <w:p>
+            <w:pPr>
+              <w:spacing w:line="240" w:lineRule="auto" w:after="0" w:before="0"/>
+            </w:pPr>
             <w:r>
               <w:rPr>
                 <w:b w:val="0"/>
@@ -3966,6 +4301,9 @@
             <w:tcW w:type="dxa" w:w="1077"/>
           </w:tcPr>
           <w:p>
+            <w:pPr>
+              <w:spacing w:line="240" w:lineRule="auto" w:after="0" w:before="0"/>
+            </w:pPr>
             <w:r>
               <w:rPr>
                 <w:b w:val="0"/>
@@ -3979,6 +4317,9 @@
             <w:tcW w:type="dxa" w:w="907"/>
           </w:tcPr>
           <w:p>
+            <w:pPr>
+              <w:spacing w:line="240" w:lineRule="auto" w:after="0" w:before="0"/>
+            </w:pPr>
             <w:r>
               <w:rPr>
                 <w:b w:val="0"/>
@@ -3992,6 +4333,9 @@
             <w:tcW w:type="dxa" w:w="2211"/>
           </w:tcPr>
           <w:p>
+            <w:pPr>
+              <w:spacing w:line="240" w:lineRule="auto" w:after="0" w:before="0"/>
+            </w:pPr>
             <w:r>
               <w:rPr>
                 <w:b w:val="0"/>
@@ -4007,6 +4351,9 @@
             <w:tcW w:type="dxa" w:w="510"/>
           </w:tcPr>
           <w:p>
+            <w:pPr>
+              <w:spacing w:line="240" w:lineRule="auto" w:after="0" w:before="0"/>
+            </w:pPr>
             <w:r>
               <w:rPr>
                 <w:b w:val="0"/>
@@ -4020,6 +4367,9 @@
             <w:tcW w:type="dxa" w:w="964"/>
           </w:tcPr>
           <w:p>
+            <w:pPr>
+              <w:spacing w:line="240" w:lineRule="auto" w:after="0" w:before="0"/>
+            </w:pPr>
             <w:r>
               <w:rPr>
                 <w:b w:val="0"/>
@@ -4033,6 +4383,9 @@
             <w:tcW w:type="dxa" w:w="2268"/>
           </w:tcPr>
           <w:p>
+            <w:pPr>
+              <w:spacing w:line="240" w:lineRule="auto" w:after="0" w:before="0"/>
+            </w:pPr>
             <w:r>
               <w:rPr>
                 <w:b w:val="0"/>
@@ -4046,6 +4399,9 @@
             <w:tcW w:type="dxa" w:w="1077"/>
           </w:tcPr>
           <w:p>
+            <w:pPr>
+              <w:spacing w:line="240" w:lineRule="auto" w:after="0" w:before="0"/>
+            </w:pPr>
             <w:r>
               <w:rPr>
                 <w:b w:val="0"/>
@@ -4059,6 +4415,9 @@
             <w:tcW w:type="dxa" w:w="907"/>
           </w:tcPr>
           <w:p>
+            <w:pPr>
+              <w:spacing w:line="240" w:lineRule="auto" w:after="0" w:before="0"/>
+            </w:pPr>
             <w:r>
               <w:rPr>
                 <w:b w:val="0"/>
@@ -4072,6 +4431,9 @@
             <w:tcW w:type="dxa" w:w="2211"/>
           </w:tcPr>
           <w:p>
+            <w:pPr>
+              <w:spacing w:line="240" w:lineRule="auto" w:after="0" w:before="0"/>
+            </w:pPr>
             <w:r>
               <w:rPr>
                 <w:b w:val="0"/>
@@ -4087,6 +4449,9 @@
             <w:tcW w:type="dxa" w:w="510"/>
           </w:tcPr>
           <w:p>
+            <w:pPr>
+              <w:spacing w:line="240" w:lineRule="auto" w:after="0" w:before="0"/>
+            </w:pPr>
             <w:r>
               <w:rPr>
                 <w:b w:val="0"/>
@@ -4100,6 +4465,9 @@
             <w:tcW w:type="dxa" w:w="964"/>
           </w:tcPr>
           <w:p>
+            <w:pPr>
+              <w:spacing w:line="240" w:lineRule="auto" w:after="0" w:before="0"/>
+            </w:pPr>
             <w:r>
               <w:rPr>
                 <w:b w:val="0"/>
@@ -4113,6 +4481,9 @@
             <w:tcW w:type="dxa" w:w="2268"/>
           </w:tcPr>
           <w:p>
+            <w:pPr>
+              <w:spacing w:line="240" w:lineRule="auto" w:after="0" w:before="0"/>
+            </w:pPr>
             <w:r>
               <w:rPr>
                 <w:b w:val="0"/>
@@ -4126,6 +4497,9 @@
             <w:tcW w:type="dxa" w:w="1077"/>
           </w:tcPr>
           <w:p>
+            <w:pPr>
+              <w:spacing w:line="240" w:lineRule="auto" w:after="0" w:before="0"/>
+            </w:pPr>
             <w:r>
               <w:rPr>
                 <w:b w:val="0"/>
@@ -4139,6 +4513,9 @@
             <w:tcW w:type="dxa" w:w="907"/>
           </w:tcPr>
           <w:p>
+            <w:pPr>
+              <w:spacing w:line="240" w:lineRule="auto" w:after="0" w:before="0"/>
+            </w:pPr>
             <w:r>
               <w:rPr>
                 <w:b w:val="0"/>
@@ -4152,6 +4529,9 @@
             <w:tcW w:type="dxa" w:w="2211"/>
           </w:tcPr>
           <w:p>
+            <w:pPr>
+              <w:spacing w:line="240" w:lineRule="auto" w:after="0" w:before="0"/>
+            </w:pPr>
             <w:r>
               <w:rPr>
                 <w:b w:val="0"/>
@@ -4167,6 +4547,9 @@
             <w:tcW w:type="dxa" w:w="510"/>
           </w:tcPr>
           <w:p>
+            <w:pPr>
+              <w:spacing w:line="240" w:lineRule="auto" w:after="0" w:before="0"/>
+            </w:pPr>
             <w:r>
               <w:rPr>
                 <w:b w:val="0"/>
@@ -4180,6 +4563,9 @@
             <w:tcW w:type="dxa" w:w="964"/>
           </w:tcPr>
           <w:p>
+            <w:pPr>
+              <w:spacing w:line="240" w:lineRule="auto" w:after="0" w:before="0"/>
+            </w:pPr>
             <w:r>
               <w:rPr>
                 <w:b w:val="0"/>
@@ -4193,6 +4579,9 @@
             <w:tcW w:type="dxa" w:w="2268"/>
           </w:tcPr>
           <w:p>
+            <w:pPr>
+              <w:spacing w:line="240" w:lineRule="auto" w:after="0" w:before="0"/>
+            </w:pPr>
             <w:r>
               <w:rPr>
                 <w:b w:val="0"/>
@@ -4206,6 +4595,9 @@
             <w:tcW w:type="dxa" w:w="1077"/>
           </w:tcPr>
           <w:p>
+            <w:pPr>
+              <w:spacing w:line="240" w:lineRule="auto" w:after="0" w:before="0"/>
+            </w:pPr>
             <w:r>
               <w:rPr>
                 <w:b w:val="0"/>
@@ -4219,6 +4611,9 @@
             <w:tcW w:type="dxa" w:w="907"/>
           </w:tcPr>
           <w:p>
+            <w:pPr>
+              <w:spacing w:line="240" w:lineRule="auto" w:after="0" w:before="0"/>
+            </w:pPr>
             <w:r>
               <w:rPr>
                 <w:b w:val="0"/>
@@ -4232,6 +4627,9 @@
             <w:tcW w:type="dxa" w:w="2211"/>
           </w:tcPr>
           <w:p>
+            <w:pPr>
+              <w:spacing w:line="240" w:lineRule="auto" w:after="0" w:before="0"/>
+            </w:pPr>
             <w:r>
               <w:rPr>
                 <w:b w:val="0"/>
@@ -4247,6 +4645,9 @@
             <w:tcW w:type="dxa" w:w="510"/>
           </w:tcPr>
           <w:p>
+            <w:pPr>
+              <w:spacing w:line="240" w:lineRule="auto" w:after="0" w:before="0"/>
+            </w:pPr>
             <w:r>
               <w:rPr>
                 <w:b w:val="0"/>
@@ -4260,6 +4661,9 @@
             <w:tcW w:type="dxa" w:w="964"/>
           </w:tcPr>
           <w:p>
+            <w:pPr>
+              <w:spacing w:line="240" w:lineRule="auto" w:after="0" w:before="0"/>
+            </w:pPr>
             <w:r>
               <w:rPr>
                 <w:b w:val="0"/>
@@ -4273,6 +4677,9 @@
             <w:tcW w:type="dxa" w:w="2268"/>
           </w:tcPr>
           <w:p>
+            <w:pPr>
+              <w:spacing w:line="240" w:lineRule="auto" w:after="0" w:before="0"/>
+            </w:pPr>
             <w:r>
               <w:rPr>
                 <w:b w:val="0"/>
@@ -4286,6 +4693,9 @@
             <w:tcW w:type="dxa" w:w="1077"/>
           </w:tcPr>
           <w:p>
+            <w:pPr>
+              <w:spacing w:line="240" w:lineRule="auto" w:after="0" w:before="0"/>
+            </w:pPr>
             <w:r>
               <w:rPr>
                 <w:b w:val="0"/>
@@ -4299,6 +4709,9 @@
             <w:tcW w:type="dxa" w:w="907"/>
           </w:tcPr>
           <w:p>
+            <w:pPr>
+              <w:spacing w:line="240" w:lineRule="auto" w:after="0" w:before="0"/>
+            </w:pPr>
             <w:r>
               <w:rPr>
                 <w:b w:val="0"/>
@@ -4312,6 +4725,9 @@
             <w:tcW w:type="dxa" w:w="2211"/>
           </w:tcPr>
           <w:p>
+            <w:pPr>
+              <w:spacing w:line="240" w:lineRule="auto" w:after="0" w:before="0"/>
+            </w:pPr>
             <w:r>
               <w:rPr>
                 <w:b w:val="0"/>
@@ -4327,6 +4743,9 @@
             <w:tcW w:type="dxa" w:w="510"/>
           </w:tcPr>
           <w:p>
+            <w:pPr>
+              <w:spacing w:line="240" w:lineRule="auto" w:after="0" w:before="0"/>
+            </w:pPr>
             <w:r>
               <w:rPr>
                 <w:b w:val="0"/>
@@ -4340,6 +4759,9 @@
             <w:tcW w:type="dxa" w:w="964"/>
           </w:tcPr>
           <w:p>
+            <w:pPr>
+              <w:spacing w:line="240" w:lineRule="auto" w:after="0" w:before="0"/>
+            </w:pPr>
             <w:r>
               <w:rPr>
                 <w:b w:val="0"/>
@@ -4353,6 +4775,9 @@
             <w:tcW w:type="dxa" w:w="2268"/>
           </w:tcPr>
           <w:p>
+            <w:pPr>
+              <w:spacing w:line="240" w:lineRule="auto" w:after="0" w:before="0"/>
+            </w:pPr>
             <w:r>
               <w:rPr>
                 <w:b w:val="0"/>
@@ -4366,6 +4791,9 @@
             <w:tcW w:type="dxa" w:w="1077"/>
           </w:tcPr>
           <w:p>
+            <w:pPr>
+              <w:spacing w:line="240" w:lineRule="auto" w:after="0" w:before="0"/>
+            </w:pPr>
             <w:r>
               <w:rPr>
                 <w:b w:val="0"/>
@@ -4379,6 +4807,9 @@
             <w:tcW w:type="dxa" w:w="907"/>
           </w:tcPr>
           <w:p>
+            <w:pPr>
+              <w:spacing w:line="240" w:lineRule="auto" w:after="0" w:before="0"/>
+            </w:pPr>
             <w:r>
               <w:rPr>
                 <w:b w:val="0"/>
@@ -4392,6 +4823,9 @@
             <w:tcW w:type="dxa" w:w="2211"/>
           </w:tcPr>
           <w:p>
+            <w:pPr>
+              <w:spacing w:line="240" w:lineRule="auto" w:after="0" w:before="0"/>
+            </w:pPr>
             <w:r>
               <w:rPr>
                 <w:b w:val="0"/>
@@ -4487,6 +4921,7 @@
     <w:p>
       <w:pPr>
         <w:pStyle w:val="Heading1"/>
+        <w:pageBreakBefore/>
         <w:spacing w:before="320" w:after="160"/>
       </w:pPr>
       <w:r>
@@ -4546,9 +4981,12 @@
         <w:gridCol w:w="4200"/>
       </w:tblGrid>
       <w:tr>
-        <w:tc>
-          <w:tcPr>
-            <w:tcW w:w="680" w:type="dxa"/>
+        <w:trPr>
+          <w:tblHeader/>
+        </w:trPr>
+        <w:tc>
+          <w:tcPr>
+            <w:tcW w:w="567" w:type="dxa"/>
             <w:shd w:val="clear" w:color="auto" w:fill="7A0C2E"/>
             <w:tcMar>
               <w:top w:w="100" w:type="dxa"/>
@@ -4559,12 +4997,16 @@
             <w:vAlign w:val="center"/>
           </w:tcPr>
           <w:p>
+            <w:pPr>
+              <w:keepNext/>
+              <w:spacing w:line="240" w:lineRule="auto" w:after="0" w:before="0"/>
+            </w:pPr>
             <w:r>
               <w:rPr>
                 <w:b/>
                 <w:bCs/>
                 <w:color w:val="FFFFFF"/>
-                <w:sz w:val="21"/>
+                <w:sz w:val="18"/>
                 <w:szCs w:val="21"/>
               </w:rPr>
               <w:t>No.</w:t>
@@ -4573,7 +5015,7 @@
         </w:tc>
         <w:tc>
           <w:tcPr>
-            <w:tcW w:w="3628" w:type="dxa"/>
+            <w:tcW w:w="3685" w:type="dxa"/>
             <w:shd w:val="clear" w:color="auto" w:fill="7A0C2E"/>
             <w:tcMar>
               <w:top w:w="100" w:type="dxa"/>
@@ -4584,12 +5026,16 @@
             <w:vAlign w:val="center"/>
           </w:tcPr>
           <w:p>
+            <w:pPr>
+              <w:keepNext/>
+              <w:spacing w:line="240" w:lineRule="auto" w:after="0" w:before="0"/>
+            </w:pPr>
             <w:r>
               <w:rPr>
                 <w:b/>
                 <w:bCs/>
                 <w:color w:val="FFFFFF"/>
-                <w:sz w:val="21"/>
+                <w:sz w:val="18"/>
                 <w:szCs w:val="21"/>
               </w:rPr>
               <w:t>Kendala</w:t>
@@ -4598,7 +5044,7 @@
         </w:tc>
         <w:tc>
           <w:tcPr>
-            <w:tcW w:w="3628" w:type="dxa"/>
+            <w:tcW w:w="3685" w:type="dxa"/>
             <w:shd w:val="clear" w:color="auto" w:fill="7A0C2E"/>
             <w:tcMar>
               <w:top w:w="100" w:type="dxa"/>
@@ -4609,12 +5055,16 @@
             <w:vAlign w:val="center"/>
           </w:tcPr>
           <w:p>
+            <w:pPr>
+              <w:keepNext/>
+              <w:spacing w:line="240" w:lineRule="auto" w:after="0" w:before="0"/>
+            </w:pPr>
             <w:r>
               <w:rPr>
                 <w:b/>
                 <w:bCs/>
                 <w:color w:val="FFFFFF"/>
-                <w:sz w:val="21"/>
+                <w:sz w:val="18"/>
                 <w:szCs w:val="21"/>
               </w:rPr>
               <w:t>Solusi</w:t>
@@ -4625,7 +5075,7 @@
       <w:tr>
         <w:tc>
           <w:tcPr>
-            <w:tcW w:w="680" w:type="dxa"/>
+            <w:tcW w:w="567" w:type="dxa"/>
             <w:tcMar>
               <w:top w:w="100" w:type="dxa"/>
               <w:left w:w="120" w:type="dxa"/>
@@ -4635,9 +5085,13 @@
             <w:vAlign w:val="center"/>
           </w:tcPr>
           <w:p>
-            <w:r>
-              <w:rPr>
-                <w:sz w:val="21"/>
+            <w:pPr>
+              <w:keepNext/>
+              <w:spacing w:line="240" w:lineRule="auto" w:after="0" w:before="0"/>
+            </w:pPr>
+            <w:r>
+              <w:rPr>
+                <w:sz w:val="18"/>
               </w:rPr>
               <w:t>1</w:t>
             </w:r>
@@ -4645,7 +5099,7 @@
         </w:tc>
         <w:tc>
           <w:tcPr>
-            <w:tcW w:w="3628" w:type="dxa"/>
+            <w:tcW w:w="3685" w:type="dxa"/>
             <w:tcMar>
               <w:top w:w="100" w:type="dxa"/>
               <w:left w:w="120" w:type="dxa"/>
@@ -4655,14 +5109,21 @@
             <w:vAlign w:val="center"/>
           </w:tcPr>
           <w:p>
-            <w:r>
+            <w:pPr>
+              <w:keepNext/>
+              <w:spacing w:line="240" w:lineRule="auto" w:after="0" w:before="0"/>
+            </w:pPr>
+            <w:r>
+              <w:rPr>
+                <w:sz w:val="18"/>
+              </w:rPr>
               <w:t>Data pada array di memori dapat kembali ke data awal setelah beberapa waktu ketika aplikasi berjalan di Vercel.</w:t>
             </w:r>
           </w:p>
         </w:tc>
         <w:tc>
           <w:tcPr>
-            <w:tcW w:w="3628" w:type="dxa"/>
+            <w:tcW w:w="3685" w:type="dxa"/>
             <w:tcMar>
               <w:top w:w="100" w:type="dxa"/>
               <w:left w:w="120" w:type="dxa"/>
@@ -4672,7 +5133,14 @@
             <w:vAlign w:val="center"/>
           </w:tcPr>
           <w:p>
-            <w:r>
+            <w:pPr>
+              <w:keepNext/>
+              <w:spacing w:line="240" w:lineRule="auto" w:after="0" w:before="0"/>
+            </w:pPr>
+            <w:r>
+              <w:rPr>
+                <w:sz w:val="18"/>
+              </w:rPr>
               <w:t>Memahami bahwa array di memori memang diperbolehkan oleh soal, dan setiap request tetap menghasilkan response yang benar.</w:t>
             </w:r>
           </w:p>
@@ -4681,7 +5149,7 @@
       <w:tr>
         <w:tc>
           <w:tcPr>
-            <w:tcW w:w="680" w:type="dxa"/>
+            <w:tcW w:w="567" w:type="dxa"/>
             <w:tcMar>
               <w:top w:w="100" w:type="dxa"/>
               <w:left w:w="120" w:type="dxa"/>
@@ -4691,9 +5159,13 @@
             <w:vAlign w:val="center"/>
           </w:tcPr>
           <w:p>
-            <w:r>
-              <w:rPr>
-                <w:sz w:val="21"/>
+            <w:pPr>
+              <w:keepNext/>
+              <w:spacing w:line="240" w:lineRule="auto" w:after="0" w:before="0"/>
+            </w:pPr>
+            <w:r>
+              <w:rPr>
+                <w:sz w:val="18"/>
               </w:rPr>
               <w:t>2</w:t>
             </w:r>
@@ -4701,7 +5173,7 @@
         </w:tc>
         <w:tc>
           <w:tcPr>
-            <w:tcW w:w="3628" w:type="dxa"/>
+            <w:tcW w:w="3685" w:type="dxa"/>
             <w:tcMar>
               <w:top w:w="100" w:type="dxa"/>
               <w:left w:w="120" w:type="dxa"/>
@@ -4711,14 +5183,21 @@
             <w:vAlign w:val="center"/>
           </w:tcPr>
           <w:p>
-            <w:r>
+            <w:pPr>
+              <w:keepNext/>
+              <w:spacing w:line="240" w:lineRule="auto" w:after="0" w:before="0"/>
+            </w:pPr>
+            <w:r>
+              <w:rPr>
+                <w:sz w:val="18"/>
+              </w:rPr>
               <w:t>Body request dalam format JSON yang rusak membuat Express mengirim response HTML bawaan.</w:t>
             </w:r>
           </w:p>
         </w:tc>
         <w:tc>
           <w:tcPr>
-            <w:tcW w:w="3628" w:type="dxa"/>
+            <w:tcW w:w="3685" w:type="dxa"/>
             <w:tcMar>
               <w:top w:w="100" w:type="dxa"/>
               <w:left w:w="120" w:type="dxa"/>
@@ -4728,7 +5207,14 @@
             <w:vAlign w:val="center"/>
           </w:tcPr>
           <w:p>
-            <w:r>
+            <w:pPr>
+              <w:keepNext/>
+              <w:spacing w:line="240" w:lineRule="auto" w:after="0" w:before="0"/>
+            </w:pPr>
+            <w:r>
+              <w:rPr>
+                <w:sz w:val="18"/>
+              </w:rPr>
               <w:t>Menambahkan error handler setelah catch-all middleware sehingga response yang bukan JSON tetap diubah menjadi JSON.</w:t>
             </w:r>
           </w:p>
@@ -4737,30 +5223,51 @@
       <w:tr>
         <w:tc>
           <w:tcPr>
-            <w:tcW w:type="dxa" w:w="680"/>
-          </w:tcPr>
-          <w:p>
-            <w:r>
+            <w:tcW w:type="dxa" w:w="567"/>
+          </w:tcPr>
+          <w:p>
+            <w:pPr>
+              <w:keepNext/>
+              <w:spacing w:line="240" w:lineRule="auto" w:after="0" w:before="0"/>
+            </w:pPr>
+            <w:r>
+              <w:rPr>
+                <w:sz w:val="18"/>
+              </w:rPr>
               <w:t>3</w:t>
             </w:r>
           </w:p>
         </w:tc>
         <w:tc>
           <w:tcPr>
-            <w:tcW w:type="dxa" w:w="3628"/>
-          </w:tcPr>
-          <w:p>
-            <w:r>
+            <w:tcW w:type="dxa" w:w="3685"/>
+          </w:tcPr>
+          <w:p>
+            <w:pPr>
+              <w:keepNext/>
+              <w:spacing w:line="240" w:lineRule="auto" w:after="0" w:before="0"/>
+            </w:pPr>
+            <w:r>
+              <w:rPr>
+                <w:sz w:val="18"/>
+              </w:rPr>
               <w:t>Filter dengan nilai yang tidak tersedia pada data, misalnya ?merek=Nokia, mengembalikan array kosong.</w:t>
             </w:r>
           </w:p>
         </w:tc>
         <w:tc>
           <w:tcPr>
-            <w:tcW w:type="dxa" w:w="3628"/>
-          </w:tcPr>
-          <w:p>
-            <w:r>
+            <w:tcW w:type="dxa" w:w="3685"/>
+          </w:tcPr>
+          <w:p>
+            <w:pPr>
+              <w:keepNext/>
+              <w:spacing w:line="240" w:lineRule="auto" w:after="0" w:before="0"/>
+            </w:pPr>
+            <w:r>
+              <w:rPr>
+                <w:sz w:val="18"/>
+              </w:rPr>
               <w:t>Sesuai ketentuan soal hasil filter boleh kosong dan tetap memakai status 200, sehingga tidak diperlakukan sebagai error.</w:t>
             </w:r>
           </w:p>
@@ -4769,30 +5276,48 @@
       <w:tr>
         <w:tc>
           <w:tcPr>
-            <w:tcW w:type="dxa" w:w="680"/>
-          </w:tcPr>
-          <w:p>
-            <w:r>
+            <w:tcW w:type="dxa" w:w="567"/>
+          </w:tcPr>
+          <w:p>
+            <w:pPr>
+              <w:spacing w:line="240" w:lineRule="auto" w:after="0" w:before="0"/>
+            </w:pPr>
+            <w:r>
+              <w:rPr>
+                <w:sz w:val="18"/>
+              </w:rPr>
               <w:t>4</w:t>
             </w:r>
           </w:p>
         </w:tc>
         <w:tc>
           <w:tcPr>
-            <w:tcW w:type="dxa" w:w="3628"/>
-          </w:tcPr>
-          <w:p>
-            <w:r>
+            <w:tcW w:type="dxa" w:w="3685"/>
+          </w:tcPr>
+          <w:p>
+            <w:pPr>
+              <w:spacing w:line="240" w:lineRule="auto" w:after="0" w:before="0"/>
+            </w:pPr>
+            <w:r>
+              <w:rPr>
+                <w:sz w:val="18"/>
+              </w:rPr>
               <w:t>Kode yang hanya mengganti nama resource dari mahasiswa lain akan bernilai 0.</w:t>
             </w:r>
           </w:p>
         </w:tc>
         <w:tc>
           <w:tcPr>
-            <w:tcW w:type="dxa" w:w="3628"/>
-          </w:tcPr>
-          <w:p>
-            <w:r>
+            <w:tcW w:type="dxa" w:w="3685"/>
+          </w:tcPr>
+          <w:p>
+            <w:pPr>
+              <w:spacing w:line="240" w:lineRule="auto" w:after="0" w:before="0"/>
+            </w:pPr>
+            <w:r>
+              <w:rPr>
+                <w:sz w:val="18"/>
+              </w:rPr>
               <w:t>Seluruh route, nama field, validasi, dan pesan error ditulis khusus untuk topik smartphone sehingga kode tidak identik dengan mahasiswa lain.</w:t>
             </w:r>
           </w:p>

</xml_diff>

<commit_message>
tempel screenshot hasil pengujian ke laporan (Gambar 1 dan Gambar 2)
</commit_message>
<xml_diff>
--- a/Laporan_Tugas1_2428240094_Fellisa_Anastasya.docx
+++ b/Laporan_Tugas1_2428240094_Fellisa_Anastasya.docx
@@ -3126,14 +3126,6 @@
     <w:tbl>
       <w:tblPr>
         <w:tblW w:w="9000" w:type="dxa"/>
-        <w:tblBorders>
-          <w:top w:val="single" w:sz="4" w:space="0" w:color="auto"/>
-          <w:left w:val="single" w:sz="4" w:space="0" w:color="auto"/>
-          <w:bottom w:val="single" w:sz="4" w:space="0" w:color="auto"/>
-          <w:right w:val="single" w:sz="4" w:space="0" w:color="auto"/>
-          <w:insideH w:val="single" w:sz="4" w:space="0" w:color="auto"/>
-          <w:insideV w:val="single" w:sz="4" w:space="0" w:color="auto"/>
-        </w:tblBorders>
         <w:tblCellMar>
           <w:left w:w="10" w:type="dxa"/>
           <w:right w:w="10" w:type="dxa"/>
@@ -3162,106 +3154,50 @@
             <w:pPr>
               <w:jc w:val="center"/>
             </w:pPr>
-            <w:r>
-              <w:rPr>
-                <w:i/>
-                <w:iCs/>
-                <w:color w:val="6B6462"/>
-                <w:sz w:val="21"/>
-                <w:szCs w:val="21"/>
-              </w:rPr>
-              <w:t xml:space="preserve">[ </w:t>
-            </w:r>
             <w:proofErr w:type="spellStart"/>
-            <w:r>
-              <w:rPr>
-                <w:i/>
-                <w:iCs/>
-                <w:color w:val="6B6462"/>
-                <w:sz w:val="21"/>
-                <w:szCs w:val="21"/>
-              </w:rPr>
-              <w:t>Tempelkan</w:t>
-            </w:r>
             <w:proofErr w:type="spellEnd"/>
-            <w:r>
-              <w:rPr>
-                <w:i/>
-                <w:iCs/>
-                <w:color w:val="6B6462"/>
-                <w:sz w:val="21"/>
-                <w:szCs w:val="21"/>
-              </w:rPr>
-              <w:t xml:space="preserve"> </w:t>
-            </w:r>
             <w:proofErr w:type="spellStart"/>
-            <w:r>
-              <w:rPr>
-                <w:i/>
-                <w:iCs/>
-                <w:color w:val="6B6462"/>
-                <w:sz w:val="21"/>
-                <w:szCs w:val="21"/>
-              </w:rPr>
-              <w:t>tangkapan</w:t>
-            </w:r>
             <w:proofErr w:type="spellEnd"/>
-            <w:r>
-              <w:rPr>
-                <w:i/>
-                <w:iCs/>
-                <w:color w:val="6B6462"/>
-                <w:sz w:val="21"/>
-                <w:szCs w:val="21"/>
-              </w:rPr>
-              <w:t xml:space="preserve"> </w:t>
-            </w:r>
             <w:proofErr w:type="spellStart"/>
-            <w:r>
-              <w:rPr>
-                <w:i/>
-                <w:iCs/>
-                <w:color w:val="6B6462"/>
-                <w:sz w:val="21"/>
-                <w:szCs w:val="21"/>
-              </w:rPr>
-              <w:t>layar</w:t>
-            </w:r>
             <w:proofErr w:type="spellEnd"/>
-            <w:r>
-              <w:rPr>
-                <w:i/>
-                <w:iCs/>
-                <w:color w:val="6B6462"/>
-                <w:sz w:val="21"/>
-                <w:szCs w:val="21"/>
-              </w:rPr>
-              <w:t xml:space="preserve"> (screenshot) di </w:t>
-            </w:r>
             <w:proofErr w:type="spellStart"/>
             <w:proofErr w:type="gramStart"/>
-            <w:r>
-              <w:rPr>
-                <w:i/>
-                <w:iCs/>
-                <w:color w:val="6B6462"/>
-                <w:sz w:val="21"/>
-                <w:szCs w:val="21"/>
-              </w:rPr>
-              <w:t>sini</w:t>
-            </w:r>
             <w:proofErr w:type="spellEnd"/>
-            <w:r>
-              <w:rPr>
-                <w:i/>
-                <w:iCs/>
-                <w:color w:val="6B6462"/>
-                <w:sz w:val="21"/>
-                <w:szCs w:val="21"/>
-              </w:rPr>
-              <w:t xml:space="preserve"> ]</w:t>
-            </w:r>
             <w:proofErr w:type="gramEnd"/>
+            <w:r>
+              <w:drawing>
+                <wp:inline xmlns:a="http://schemas.openxmlformats.org/drawingml/2006/main" xmlns:pic="http://schemas.openxmlformats.org/drawingml/2006/picture">
+                  <wp:extent cx="4860000" cy="2186614"/>
+                  <wp:docPr id="2" name="Picture 2"/>
+                  <wp:cNvGraphicFramePr>
+                    <a:graphicFrameLocks noChangeAspect="1"/>
+                  </wp:cNvGraphicFramePr>
+                  <a:graphic>
+                    <a:graphicData uri="http://schemas.openxmlformats.org/drawingml/2006/picture">
+                      <pic:pic>
+                        <pic:nvPicPr>
+                          <pic:cNvPr id="0" name="Gambar_1_GET_smartphones.png"/>
+                          <pic:cNvPicPr/>
+                        </pic:nvPicPr>
+                        <pic:blipFill>
+                          <a:blip r:embed="rId12"/>
+                          <a:stretch>
+                            <a:fillRect/>
+                          </a:stretch>
+                        </pic:blipFill>
+                        <pic:spPr>
+                          <a:xfrm>
+                            <a:off x="0" y="0"/>
+                            <a:ext cx="4860000" cy="2186614"/>
+                          </a:xfrm>
+                          <a:prstGeom prst="rect"/>
+                        </pic:spPr>
+                      </pic:pic>
+                    </a:graphicData>
+                  </a:graphic>
+                </wp:inline>
+              </w:drawing>
+            </w:r>
           </w:p>
         </w:tc>
       </w:tr>
@@ -3282,14 +3218,6 @@
     <w:tbl>
       <w:tblPr>
         <w:tblW w:w="9000" w:type="dxa"/>
-        <w:tblBorders>
-          <w:top w:val="single" w:sz="4" w:space="0" w:color="auto"/>
-          <w:left w:val="single" w:sz="4" w:space="0" w:color="auto"/>
-          <w:bottom w:val="single" w:sz="4" w:space="0" w:color="auto"/>
-          <w:right w:val="single" w:sz="4" w:space="0" w:color="auto"/>
-          <w:insideH w:val="single" w:sz="4" w:space="0" w:color="auto"/>
-          <w:insideV w:val="single" w:sz="4" w:space="0" w:color="auto"/>
-        </w:tblBorders>
         <w:tblCellMar>
           <w:left w:w="10" w:type="dxa"/>
           <w:right w:w="10" w:type="dxa"/>
@@ -3318,107 +3246,50 @@
             <w:pPr>
               <w:jc w:val="center"/>
             </w:pPr>
-            <w:r>
-              <w:rPr>
-                <w:i/>
-                <w:iCs/>
-                <w:color w:val="6B6462"/>
-                <w:sz w:val="21"/>
-                <w:szCs w:val="21"/>
-              </w:rPr>
-              <w:lastRenderedPageBreak/>
-              <w:t xml:space="preserve">[ </w:t>
-            </w:r>
             <w:proofErr w:type="spellStart"/>
-            <w:r>
-              <w:rPr>
-                <w:i/>
-                <w:iCs/>
-                <w:color w:val="6B6462"/>
-                <w:sz w:val="21"/>
-                <w:szCs w:val="21"/>
-              </w:rPr>
-              <w:t>Tempelkan</w:t>
-            </w:r>
             <w:proofErr w:type="spellEnd"/>
-            <w:r>
-              <w:rPr>
-                <w:i/>
-                <w:iCs/>
-                <w:color w:val="6B6462"/>
-                <w:sz w:val="21"/>
-                <w:szCs w:val="21"/>
-              </w:rPr>
-              <w:t xml:space="preserve"> </w:t>
-            </w:r>
             <w:proofErr w:type="spellStart"/>
-            <w:r>
-              <w:rPr>
-                <w:i/>
-                <w:iCs/>
-                <w:color w:val="6B6462"/>
-                <w:sz w:val="21"/>
-                <w:szCs w:val="21"/>
-              </w:rPr>
-              <w:t>tangkapan</w:t>
-            </w:r>
             <w:proofErr w:type="spellEnd"/>
-            <w:r>
-              <w:rPr>
-                <w:i/>
-                <w:iCs/>
-                <w:color w:val="6B6462"/>
-                <w:sz w:val="21"/>
-                <w:szCs w:val="21"/>
-              </w:rPr>
-              <w:t xml:space="preserve"> </w:t>
-            </w:r>
             <w:proofErr w:type="spellStart"/>
-            <w:r>
-              <w:rPr>
-                <w:i/>
-                <w:iCs/>
-                <w:color w:val="6B6462"/>
-                <w:sz w:val="21"/>
-                <w:szCs w:val="21"/>
-              </w:rPr>
-              <w:t>layar</w:t>
-            </w:r>
             <w:proofErr w:type="spellEnd"/>
-            <w:r>
-              <w:rPr>
-                <w:i/>
-                <w:iCs/>
-                <w:color w:val="6B6462"/>
-                <w:sz w:val="21"/>
-                <w:szCs w:val="21"/>
-              </w:rPr>
-              <w:t xml:space="preserve"> (screenshot) di </w:t>
-            </w:r>
             <w:proofErr w:type="spellStart"/>
             <w:proofErr w:type="gramStart"/>
-            <w:r>
-              <w:rPr>
-                <w:i/>
-                <w:iCs/>
-                <w:color w:val="6B6462"/>
-                <w:sz w:val="21"/>
-                <w:szCs w:val="21"/>
-              </w:rPr>
-              <w:t>sini</w:t>
-            </w:r>
             <w:proofErr w:type="spellEnd"/>
-            <w:r>
-              <w:rPr>
-                <w:i/>
-                <w:iCs/>
-                <w:color w:val="6B6462"/>
-                <w:sz w:val="21"/>
-                <w:szCs w:val="21"/>
-              </w:rPr>
-              <w:t xml:space="preserve"> ]</w:t>
-            </w:r>
             <w:proofErr w:type="gramEnd"/>
+            <w:r>
+              <w:drawing>
+                <wp:inline xmlns:a="http://schemas.openxmlformats.org/drawingml/2006/main" xmlns:pic="http://schemas.openxmlformats.org/drawingml/2006/picture">
+                  <wp:extent cx="4860000" cy="2186614"/>
+                  <wp:docPr id="3" name="Picture 3"/>
+                  <wp:cNvGraphicFramePr>
+                    <a:graphicFrameLocks noChangeAspect="1"/>
+                  </wp:cNvGraphicFramePr>
+                  <a:graphic>
+                    <a:graphicData uri="http://schemas.openxmlformats.org/drawingml/2006/picture">
+                      <pic:pic>
+                        <pic:nvPicPr>
+                          <pic:cNvPr id="0" name="Gambar_2_POST_PUT_DELETE.png"/>
+                          <pic:cNvPicPr/>
+                        </pic:nvPicPr>
+                        <pic:blipFill>
+                          <a:blip r:embed="rId13"/>
+                          <a:stretch>
+                            <a:fillRect/>
+                          </a:stretch>
+                        </pic:blipFill>
+                        <pic:spPr>
+                          <a:xfrm>
+                            <a:off x="0" y="0"/>
+                            <a:ext cx="4860000" cy="2186614"/>
+                          </a:xfrm>
+                          <a:prstGeom prst="rect"/>
+                        </pic:spPr>
+                      </pic:pic>
+                    </a:graphicData>
+                  </a:graphic>
+                </wp:inline>
+              </w:drawing>
+            </w:r>
           </w:p>
         </w:tc>
       </w:tr>

</xml_diff>

<commit_message>
sinkronisasi laporan dengan app.js versi terbaru
</commit_message>
<xml_diff>
--- a/Laporan_Tugas1_2428240094_Fellisa_Anastasya.docx
+++ b/Laporan_Tugas1_2428240094_Fellisa_Anastasya.docx
@@ -6118,102 +6118,22 @@
           <w:sz w:val="24"/>
         </w:rPr>
       </w:pPr>
-      <w:r>
-        <w:rPr>
-          <w:rFonts w:ascii="Times New Roman" w:hAnsi="Times New Roman" w:cs="Times New Roman"/>
-          <w:i/>
-          <w:sz w:val="24"/>
-        </w:rPr>
-        <w:t xml:space="preserve">Gambar 1. Hasil pengujian </w:t>
-      </w:r>
-      <w:proofErr w:type="spellStart"/>
-      <w:r>
-        <w:rPr>
-          <w:rFonts w:ascii="Times New Roman" w:hAnsi="Times New Roman" w:cs="Times New Roman"/>
-          <w:i/>
-          <w:sz w:val="24"/>
-        </w:rPr>
-        <w:t>endpoint</w:t>
-      </w:r>
-      <w:proofErr w:type="spellEnd"/>
-      <w:r>
-        <w:rPr>
-          <w:rFonts w:ascii="Times New Roman" w:hAnsi="Times New Roman" w:cs="Times New Roman"/>
-          <w:i/>
-          <w:sz w:val="24"/>
-        </w:rPr>
-        <w:t xml:space="preserve"> GET /</w:t>
-      </w:r>
-      <w:proofErr w:type="spellStart"/>
-      <w:r>
-        <w:rPr>
-          <w:rFonts w:ascii="Times New Roman" w:hAnsi="Times New Roman" w:cs="Times New Roman"/>
-          <w:i/>
-          <w:sz w:val="24"/>
-        </w:rPr>
-        <w:t>smartphones</w:t>
-      </w:r>
-      <w:proofErr w:type="spellEnd"/>
-      <w:r>
-        <w:rPr>
-          <w:rFonts w:ascii="Times New Roman" w:hAnsi="Times New Roman" w:cs="Times New Roman"/>
-          <w:i/>
-          <w:sz w:val="24"/>
-        </w:rPr>
-        <w:t>, GET /</w:t>
-      </w:r>
-      <w:proofErr w:type="spellStart"/>
-      <w:r>
-        <w:rPr>
-          <w:rFonts w:ascii="Times New Roman" w:hAnsi="Times New Roman" w:cs="Times New Roman"/>
-          <w:i/>
-          <w:sz w:val="24"/>
-        </w:rPr>
-        <w:t>smartphones</w:t>
-      </w:r>
-      <w:proofErr w:type="spellEnd"/>
-      <w:r>
-        <w:rPr>
-          <w:rFonts w:ascii="Times New Roman" w:hAnsi="Times New Roman" w:cs="Times New Roman"/>
-          <w:i/>
-          <w:sz w:val="24"/>
-        </w:rPr>
-        <w:t>/:</w:t>
-      </w:r>
-      <w:proofErr w:type="spellStart"/>
-      <w:r>
-        <w:rPr>
-          <w:rFonts w:ascii="Times New Roman" w:hAnsi="Times New Roman" w:cs="Times New Roman"/>
-          <w:i/>
-          <w:sz w:val="24"/>
-        </w:rPr>
-        <w:t>id</w:t>
-      </w:r>
-      <w:proofErr w:type="spellEnd"/>
-      <w:r>
-        <w:rPr>
-          <w:rFonts w:ascii="Times New Roman" w:hAnsi="Times New Roman" w:cs="Times New Roman"/>
-          <w:i/>
-          <w:sz w:val="24"/>
-        </w:rPr>
-        <w:t xml:space="preserve">, dan filter ?merek= pada URL </w:t>
-      </w:r>
-      <w:proofErr w:type="spellStart"/>
-      <w:r>
-        <w:rPr>
-          <w:rFonts w:ascii="Times New Roman" w:hAnsi="Times New Roman" w:cs="Times New Roman"/>
-          <w:i/>
-          <w:sz w:val="24"/>
-        </w:rPr>
-        <w:t>Vercel</w:t>
-      </w:r>
-      <w:proofErr w:type="spellEnd"/>
-      <w:r>
-        <w:rPr>
-          <w:rFonts w:ascii="Times New Roman" w:hAnsi="Times New Roman" w:cs="Times New Roman"/>
-          <w:sz w:val="24"/>
-        </w:rPr>
-        <w:t xml:space="preserve"> </w:t>
+      <w:proofErr w:type="spellStart"/>
+      <w:proofErr w:type="spellEnd"/>
+      <w:proofErr w:type="spellStart"/>
+      <w:proofErr w:type="spellEnd"/>
+      <w:proofErr w:type="spellStart"/>
+      <w:proofErr w:type="spellEnd"/>
+      <w:proofErr w:type="spellStart"/>
+      <w:proofErr w:type="spellEnd"/>
+      <w:proofErr w:type="spellStart"/>
+      <w:proofErr w:type="spellEnd"/>
+      <w:r>
+        <w:rPr>
+          <w:rFonts w:ascii="Times New Roman" w:hAnsi="Times New Roman" w:eastAsia="Times New Roman"/>
+          <w:sz w:val="20"/>
+        </w:rPr>
+        <w:t>Gambar 1. Hasil pengujian endpoint GET /smartphones, GET /smartphones/:id, dan filter ?merek= pada URL Vercel</w:t>
       </w:r>
     </w:p>
     <w:p>
@@ -6231,41 +6151,47 @@
           <w:sz w:val="24"/>
         </w:rPr>
       </w:pPr>
-      <w:r>
-        <w:rPr>
-          <w:rFonts w:ascii="Times New Roman" w:hAnsi="Times New Roman" w:cs="Times New Roman"/>
-          <w:i/>
-          <w:color w:val="6B6462"/>
-          <w:sz w:val="24"/>
-        </w:rPr>
-        <w:t>[ Tempelkan tangkapan layar (</w:t>
-      </w:r>
-      <w:proofErr w:type="spellStart"/>
-      <w:r>
-        <w:rPr>
-          <w:rFonts w:ascii="Times New Roman" w:hAnsi="Times New Roman" w:cs="Times New Roman"/>
-          <w:i/>
-          <w:color w:val="6B6462"/>
-          <w:sz w:val="24"/>
-        </w:rPr>
-        <w:t>screenshot</w:t>
-      </w:r>
-      <w:proofErr w:type="spellEnd"/>
-      <w:r>
-        <w:rPr>
-          <w:rFonts w:ascii="Times New Roman" w:hAnsi="Times New Roman" w:cs="Times New Roman"/>
-          <w:i/>
-          <w:color w:val="6B6462"/>
-          <w:sz w:val="24"/>
-        </w:rPr>
-        <w:t>) di sini ]</w:t>
-      </w:r>
-      <w:r>
-        <w:rPr>
-          <w:rFonts w:ascii="Times New Roman" w:hAnsi="Times New Roman" w:cs="Times New Roman"/>
-          <w:sz w:val="24"/>
-        </w:rPr>
-        <w:t xml:space="preserve"> </w:t>
+      <w:proofErr w:type="spellStart"/>
+      <w:proofErr w:type="spellEnd"/>
+      <w:r>
+        <w:rPr>
+          <w:rFonts w:ascii="Times New Roman" w:hAnsi="Times New Roman" w:eastAsia="Times New Roman"/>
+          <w:sz w:val="16"/>
+        </w:rPr>
+      </w:r>
+      <w:r>
+        <w:drawing>
+          <wp:inline xmlns:a="http://schemas.openxmlformats.org/drawingml/2006/main" xmlns:pic="http://schemas.openxmlformats.org/drawingml/2006/picture">
+            <wp:extent cx="4860000" cy="2186614"/>
+            <wp:docPr id="1227664009" name="Picture 1227664009"/>
+            <wp:cNvGraphicFramePr>
+              <a:graphicFrameLocks noChangeAspect="1"/>
+            </wp:cNvGraphicFramePr>
+            <a:graphic>
+              <a:graphicData uri="http://schemas.openxmlformats.org/drawingml/2006/picture">
+                <pic:pic>
+                  <pic:nvPicPr>
+                    <pic:cNvPr id="0" name="Gambar_1_GET_smartphones.png"/>
+                    <pic:cNvPicPr/>
+                  </pic:nvPicPr>
+                  <pic:blipFill>
+                    <a:blip r:embed="rId19"/>
+                    <a:stretch>
+                      <a:fillRect/>
+                    </a:stretch>
+                  </pic:blipFill>
+                  <pic:spPr>
+                    <a:xfrm>
+                      <a:off x="0" y="0"/>
+                      <a:ext cx="4860000" cy="2186614"/>
+                    </a:xfrm>
+                    <a:prstGeom prst="rect"/>
+                  </pic:spPr>
+                </pic:pic>
+              </a:graphicData>
+            </a:graphic>
+          </wp:inline>
+        </w:drawing>
       </w:r>
     </w:p>
     <w:p>
@@ -6277,31 +6203,14 @@
           <w:sz w:val="24"/>
         </w:rPr>
       </w:pPr>
-      <w:r>
-        <w:rPr>
-          <w:rFonts w:ascii="Times New Roman" w:hAnsi="Times New Roman" w:cs="Times New Roman"/>
-          <w:i/>
-          <w:sz w:val="24"/>
-        </w:rPr>
-        <w:t xml:space="preserve">Gambar 2. Hasil pengujian </w:t>
-      </w:r>
-      <w:proofErr w:type="spellStart"/>
-      <w:r>
-        <w:rPr>
-          <w:rFonts w:ascii="Times New Roman" w:hAnsi="Times New Roman" w:cs="Times New Roman"/>
-          <w:i/>
-          <w:sz w:val="24"/>
-        </w:rPr>
-        <w:t>endpoint</w:t>
-      </w:r>
-      <w:proofErr w:type="spellEnd"/>
-      <w:r>
-        <w:rPr>
-          <w:rFonts w:ascii="Times New Roman" w:hAnsi="Times New Roman" w:cs="Times New Roman"/>
-          <w:i/>
-          <w:sz w:val="24"/>
-        </w:rPr>
-        <w:t xml:space="preserve"> POST, PUT, DELETE, serta kasus gagal 400 dan 404 pada URL </w:t>
+      <w:proofErr w:type="spellStart"/>
+      <w:proofErr w:type="spellEnd"/>
+      <w:r>
+        <w:rPr>
+          <w:rFonts w:ascii="Times New Roman" w:hAnsi="Times New Roman" w:eastAsia="Times New Roman"/>
+          <w:sz w:val="20"/>
+        </w:rPr>
+        <w:t>Gambar 2. Hasil pengujian endpoint POST, PUT, DELETE, serta kasus gagal 400 dan 404 pada URL Vercel</w:t>
       </w:r>
     </w:p>
     <w:p>

</xml_diff>

<commit_message>
perbarui tabel 5.1 hasil uji sesuai app.js terbaru (PUT 400 sebelum 404)
</commit_message>
<xml_diff>
--- a/Laporan_Tugas1_2428240094_Fellisa_Anastasya.docx
+++ b/Laporan_Tugas1_2428240094_Fellisa_Anastasya.docx
@@ -6560,6 +6560,7 @@
             <w:r>
               <w:rPr>
                 <w:rFonts w:ascii="Times New Roman" w:hAnsi="Times New Roman" w:eastAsia="Times New Roman"/>
+                <w:sz w:val="18"/>
               </w:rPr>
               <w:t>1</w:t>
             </w:r>
@@ -6587,6 +6588,7 @@
             <w:r>
               <w:rPr>
                 <w:rFonts w:ascii="Times New Roman" w:hAnsi="Times New Roman" w:eastAsia="Times New Roman"/>
+                <w:sz w:val="18"/>
               </w:rPr>
               <w:t>GET</w:t>
             </w:r>
@@ -6616,6 +6618,7 @@
             <w:r>
               <w:rPr>
                 <w:rFonts w:ascii="Times New Roman" w:hAnsi="Times New Roman" w:eastAsia="Times New Roman"/>
+                <w:sz w:val="18"/>
               </w:rPr>
               <w:t>/smartphones</w:t>
             </w:r>
@@ -6643,6 +6646,7 @@
             <w:r>
               <w:rPr>
                 <w:rFonts w:ascii="Times New Roman" w:hAnsi="Times New Roman" w:eastAsia="Times New Roman"/>
+                <w:sz w:val="18"/>
               </w:rPr>
               <w:t>200</w:t>
             </w:r>
@@ -6670,6 +6674,7 @@
             <w:r>
               <w:rPr>
                 <w:rFonts w:ascii="Times New Roman" w:hAnsi="Times New Roman" w:eastAsia="Times New Roman"/>
+                <w:sz w:val="18"/>
               </w:rPr>
               <w:t>200</w:t>
             </w:r>
@@ -6699,6 +6704,7 @@
             <w:r>
               <w:rPr>
                 <w:rFonts w:ascii="Times New Roman" w:hAnsi="Times New Roman" w:eastAsia="Times New Roman"/>
+                <w:sz w:val="18"/>
               </w:rPr>
               <w:t>Array 3 data awal</w:t>
             </w:r>
@@ -6731,6 +6737,7 @@
             <w:r>
               <w:rPr>
                 <w:rFonts w:ascii="Times New Roman" w:hAnsi="Times New Roman" w:eastAsia="Times New Roman"/>
+                <w:sz w:val="18"/>
               </w:rPr>
               <w:t>2</w:t>
             </w:r>
@@ -6758,6 +6765,7 @@
             <w:r>
               <w:rPr>
                 <w:rFonts w:ascii="Times New Roman" w:hAnsi="Times New Roman" w:eastAsia="Times New Roman"/>
+                <w:sz w:val="18"/>
               </w:rPr>
               <w:t>GET</w:t>
             </w:r>
@@ -6787,6 +6795,7 @@
             <w:r>
               <w:rPr>
                 <w:rFonts w:ascii="Times New Roman" w:hAnsi="Times New Roman" w:eastAsia="Times New Roman"/>
+                <w:sz w:val="18"/>
               </w:rPr>
               <w:t>/smartphones/1</w:t>
             </w:r>
@@ -6814,6 +6823,7 @@
             <w:r>
               <w:rPr>
                 <w:rFonts w:ascii="Times New Roman" w:hAnsi="Times New Roman" w:eastAsia="Times New Roman"/>
+                <w:sz w:val="18"/>
               </w:rPr>
               <w:t>200</w:t>
             </w:r>
@@ -6841,6 +6851,7 @@
             <w:r>
               <w:rPr>
                 <w:rFonts w:ascii="Times New Roman" w:hAnsi="Times New Roman" w:eastAsia="Times New Roman"/>
+                <w:sz w:val="18"/>
               </w:rPr>
               <w:t>200</w:t>
             </w:r>
@@ -6870,6 +6881,7 @@
             <w:r>
               <w:rPr>
                 <w:rFonts w:ascii="Times New Roman" w:hAnsi="Times New Roman" w:eastAsia="Times New Roman"/>
+                <w:sz w:val="18"/>
               </w:rPr>
               <w:t>Objek data id 1</w:t>
             </w:r>
@@ -6902,6 +6914,7 @@
             <w:r>
               <w:rPr>
                 <w:rFonts w:ascii="Times New Roman" w:hAnsi="Times New Roman" w:eastAsia="Times New Roman"/>
+                <w:sz w:val="18"/>
               </w:rPr>
               <w:t>3</w:t>
             </w:r>
@@ -6929,6 +6942,7 @@
             <w:r>
               <w:rPr>
                 <w:rFonts w:ascii="Times New Roman" w:hAnsi="Times New Roman" w:eastAsia="Times New Roman"/>
+                <w:sz w:val="18"/>
               </w:rPr>
               <w:t>GET</w:t>
             </w:r>
@@ -6958,6 +6972,7 @@
             <w:r>
               <w:rPr>
                 <w:rFonts w:ascii="Times New Roman" w:hAnsi="Times New Roman" w:eastAsia="Times New Roman"/>
+                <w:sz w:val="18"/>
               </w:rPr>
               <w:t>/smartphones/99</w:t>
             </w:r>
@@ -6985,6 +7000,7 @@
             <w:r>
               <w:rPr>
                 <w:rFonts w:ascii="Times New Roman" w:hAnsi="Times New Roman" w:eastAsia="Times New Roman"/>
+                <w:sz w:val="18"/>
               </w:rPr>
               <w:t>404</w:t>
             </w:r>
@@ -7012,6 +7028,7 @@
             <w:r>
               <w:rPr>
                 <w:rFonts w:ascii="Times New Roman" w:hAnsi="Times New Roman" w:eastAsia="Times New Roman"/>
+                <w:sz w:val="18"/>
               </w:rPr>
               <w:t>404</w:t>
             </w:r>
@@ -7041,6 +7058,7 @@
             <w:r>
               <w:rPr>
                 <w:rFonts w:ascii="Times New Roman" w:hAnsi="Times New Roman" w:eastAsia="Times New Roman"/>
+                <w:sz w:val="18"/>
               </w:rPr>
               <w:t>Data dengan id tidak ditemukan</w:t>
             </w:r>
@@ -7073,6 +7091,7 @@
             <w:r>
               <w:rPr>
                 <w:rFonts w:ascii="Times New Roman" w:hAnsi="Times New Roman" w:eastAsia="Times New Roman"/>
+                <w:sz w:val="18"/>
               </w:rPr>
               <w:t>4</w:t>
             </w:r>
@@ -7100,6 +7119,7 @@
             <w:r>
               <w:rPr>
                 <w:rFonts w:ascii="Times New Roman" w:hAnsi="Times New Roman" w:eastAsia="Times New Roman"/>
+                <w:sz w:val="18"/>
               </w:rPr>
               <w:t>GET</w:t>
             </w:r>
@@ -7129,6 +7149,7 @@
             <w:r>
               <w:rPr>
                 <w:rFonts w:ascii="Times New Roman" w:hAnsi="Times New Roman" w:eastAsia="Times New Roman"/>
+                <w:sz w:val="18"/>
               </w:rPr>
               <w:t>/smartphones?merek=Xiaomi</w:t>
             </w:r>
@@ -7182,6 +7203,7 @@
             <w:r>
               <w:rPr>
                 <w:rFonts w:ascii="Times New Roman" w:hAnsi="Times New Roman" w:eastAsia="Times New Roman"/>
+                <w:sz w:val="18"/>
               </w:rPr>
               <w:t>200</w:t>
             </w:r>
@@ -7209,6 +7231,7 @@
             <w:r>
               <w:rPr>
                 <w:rFonts w:ascii="Times New Roman" w:hAnsi="Times New Roman" w:eastAsia="Times New Roman"/>
+                <w:sz w:val="18"/>
               </w:rPr>
               <w:t>200</w:t>
             </w:r>
@@ -7238,6 +7261,7 @@
             <w:r>
               <w:rPr>
                 <w:rFonts w:ascii="Times New Roman" w:hAnsi="Times New Roman" w:eastAsia="Times New Roman"/>
+                <w:sz w:val="18"/>
               </w:rPr>
               <w:t>1 data merek Xiaomi</w:t>
             </w:r>
@@ -7270,6 +7294,7 @@
             <w:r>
               <w:rPr>
                 <w:rFonts w:ascii="Times New Roman" w:hAnsi="Times New Roman" w:eastAsia="Times New Roman"/>
+                <w:sz w:val="18"/>
               </w:rPr>
               <w:t>5</w:t>
             </w:r>
@@ -7297,6 +7322,7 @@
             <w:r>
               <w:rPr>
                 <w:rFonts w:ascii="Times New Roman" w:hAnsi="Times New Roman" w:eastAsia="Times New Roman"/>
+                <w:sz w:val="18"/>
               </w:rPr>
               <w:t>GET</w:t>
             </w:r>
@@ -7326,6 +7352,7 @@
             <w:r>
               <w:rPr>
                 <w:rFonts w:ascii="Times New Roman" w:hAnsi="Times New Roman" w:eastAsia="Times New Roman"/>
+                <w:sz w:val="18"/>
               </w:rPr>
               <w:t>/smartphones?merek=Nokia</w:t>
             </w:r>
@@ -7370,6 +7397,7 @@
             <w:r>
               <w:rPr>
                 <w:rFonts w:ascii="Times New Roman" w:hAnsi="Times New Roman" w:eastAsia="Times New Roman"/>
+                <w:sz w:val="18"/>
               </w:rPr>
               <w:t>200</w:t>
             </w:r>
@@ -7397,6 +7425,7 @@
             <w:r>
               <w:rPr>
                 <w:rFonts w:ascii="Times New Roman" w:hAnsi="Times New Roman" w:eastAsia="Times New Roman"/>
+                <w:sz w:val="18"/>
               </w:rPr>
               <w:t>200</w:t>
             </w:r>
@@ -7426,6 +7455,7 @@
             <w:r>
               <w:rPr>
                 <w:rFonts w:ascii="Times New Roman" w:hAnsi="Times New Roman" w:eastAsia="Times New Roman"/>
+                <w:sz w:val="18"/>
               </w:rPr>
               <w:t>Array kosong, sesuai ketentuan</w:t>
             </w:r>
@@ -7458,6 +7488,7 @@
             <w:r>
               <w:rPr>
                 <w:rFonts w:ascii="Times New Roman" w:hAnsi="Times New Roman" w:eastAsia="Times New Roman"/>
+                <w:sz w:val="18"/>
               </w:rPr>
               <w:t>6</w:t>
             </w:r>
@@ -7485,6 +7516,7 @@
             <w:r>
               <w:rPr>
                 <w:rFonts w:ascii="Times New Roman" w:hAnsi="Times New Roman" w:eastAsia="Times New Roman"/>
+                <w:sz w:val="18"/>
               </w:rPr>
               <w:t>POST</w:t>
             </w:r>
@@ -7514,6 +7546,7 @@
             <w:r>
               <w:rPr>
                 <w:rFonts w:ascii="Times New Roman" w:hAnsi="Times New Roman" w:eastAsia="Times New Roman"/>
+                <w:sz w:val="18"/>
               </w:rPr>
               <w:t>/smartphones</w:t>
             </w:r>
@@ -7541,6 +7574,7 @@
             <w:r>
               <w:rPr>
                 <w:rFonts w:ascii="Times New Roman" w:hAnsi="Times New Roman" w:eastAsia="Times New Roman"/>
+                <w:sz w:val="18"/>
               </w:rPr>
               <w:t>201</w:t>
             </w:r>
@@ -7568,6 +7602,7 @@
             <w:r>
               <w:rPr>
                 <w:rFonts w:ascii="Times New Roman" w:hAnsi="Times New Roman" w:eastAsia="Times New Roman"/>
+                <w:sz w:val="18"/>
               </w:rPr>
               <w:t>201</w:t>
             </w:r>
@@ -7597,6 +7632,7 @@
             <w:r>
               <w:rPr>
                 <w:rFonts w:ascii="Times New Roman" w:hAnsi="Times New Roman" w:eastAsia="Times New Roman"/>
+                <w:sz w:val="18"/>
               </w:rPr>
               <w:t>Id 4 dibuat otomatis oleh server</w:t>
             </w:r>
@@ -7629,6 +7665,7 @@
             <w:r>
               <w:rPr>
                 <w:rFonts w:ascii="Times New Roman" w:hAnsi="Times New Roman" w:eastAsia="Times New Roman"/>
+                <w:sz w:val="18"/>
               </w:rPr>
               <w:t>7</w:t>
             </w:r>
@@ -7656,6 +7693,7 @@
             <w:r>
               <w:rPr>
                 <w:rFonts w:ascii="Times New Roman" w:hAnsi="Times New Roman" w:eastAsia="Times New Roman"/>
+                <w:sz w:val="18"/>
               </w:rPr>
               <w:t>POST</w:t>
             </w:r>
@@ -7685,6 +7723,7 @@
             <w:r>
               <w:rPr>
                 <w:rFonts w:ascii="Times New Roman" w:hAnsi="Times New Roman" w:eastAsia="Times New Roman"/>
+                <w:sz w:val="18"/>
               </w:rPr>
               <w:t>/smartphones</w:t>
             </w:r>
@@ -7712,6 +7751,7 @@
             <w:r>
               <w:rPr>
                 <w:rFonts w:ascii="Times New Roman" w:hAnsi="Times New Roman" w:eastAsia="Times New Roman"/>
+                <w:sz w:val="18"/>
               </w:rPr>
               <w:t>400</w:t>
             </w:r>
@@ -7739,6 +7779,7 @@
             <w:r>
               <w:rPr>
                 <w:rFonts w:ascii="Times New Roman" w:hAnsi="Times New Roman" w:eastAsia="Times New Roman"/>
+                <w:sz w:val="18"/>
               </w:rPr>
               <w:t>400</w:t>
             </w:r>
@@ -7768,6 +7809,7 @@
             <w:r>
               <w:rPr>
                 <w:rFonts w:ascii="Times New Roman" w:hAnsi="Times New Roman" w:eastAsia="Times New Roman"/>
+                <w:sz w:val="18"/>
               </w:rPr>
               <w:t>Field wajib kosong, ditolak</w:t>
             </w:r>
@@ -7800,6 +7842,7 @@
             <w:r>
               <w:rPr>
                 <w:rFonts w:ascii="Times New Roman" w:hAnsi="Times New Roman" w:eastAsia="Times New Roman"/>
+                <w:sz w:val="18"/>
               </w:rPr>
               <w:t>8</w:t>
             </w:r>
@@ -7827,6 +7870,7 @@
             <w:r>
               <w:rPr>
                 <w:rFonts w:ascii="Times New Roman" w:hAnsi="Times New Roman" w:eastAsia="Times New Roman"/>
+                <w:sz w:val="18"/>
               </w:rPr>
               <w:t>PUT</w:t>
             </w:r>
@@ -7856,6 +7900,7 @@
             <w:r>
               <w:rPr>
                 <w:rFonts w:ascii="Times New Roman" w:hAnsi="Times New Roman" w:eastAsia="Times New Roman"/>
+                <w:sz w:val="18"/>
               </w:rPr>
               <w:t>/smartphones/2</w:t>
             </w:r>
@@ -7883,6 +7928,7 @@
             <w:r>
               <w:rPr>
                 <w:rFonts w:ascii="Times New Roman" w:hAnsi="Times New Roman" w:eastAsia="Times New Roman"/>
+                <w:sz w:val="18"/>
               </w:rPr>
               <w:t>200</w:t>
             </w:r>
@@ -7910,6 +7956,7 @@
             <w:r>
               <w:rPr>
                 <w:rFonts w:ascii="Times New Roman" w:hAnsi="Times New Roman" w:eastAsia="Times New Roman"/>
+                <w:sz w:val="18"/>
               </w:rPr>
               <w:t>200</w:t>
             </w:r>
@@ -7939,6 +7986,7 @@
             <w:r>
               <w:rPr>
                 <w:rFonts w:ascii="Times New Roman" w:hAnsi="Times New Roman" w:eastAsia="Times New Roman"/>
+                <w:sz w:val="18"/>
               </w:rPr>
               <w:t>Penggantian penuh, id tetap</w:t>
             </w:r>
@@ -7971,6 +8019,7 @@
             <w:r>
               <w:rPr>
                 <w:rFonts w:ascii="Times New Roman" w:hAnsi="Times New Roman" w:eastAsia="Times New Roman"/>
+                <w:sz w:val="18"/>
               </w:rPr>
               <w:t>9</w:t>
             </w:r>
@@ -7998,6 +8047,7 @@
             <w:r>
               <w:rPr>
                 <w:rFonts w:ascii="Times New Roman" w:hAnsi="Times New Roman" w:eastAsia="Times New Roman"/>
+                <w:sz w:val="18"/>
               </w:rPr>
               <w:t>PUT</w:t>
             </w:r>
@@ -8027,6 +8077,7 @@
             <w:r>
               <w:rPr>
                 <w:rFonts w:ascii="Times New Roman" w:hAnsi="Times New Roman" w:eastAsia="Times New Roman"/>
+                <w:sz w:val="18"/>
               </w:rPr>
               <w:t>/smartphones/99</w:t>
             </w:r>
@@ -8054,6 +8105,7 @@
             <w:r>
               <w:rPr>
                 <w:rFonts w:ascii="Times New Roman" w:hAnsi="Times New Roman" w:eastAsia="Times New Roman"/>
+                <w:sz w:val="18"/>
               </w:rPr>
               <w:t>400</w:t>
             </w:r>
@@ -8081,6 +8133,7 @@
             <w:r>
               <w:rPr>
                 <w:rFonts w:ascii="Times New Roman" w:hAnsi="Times New Roman" w:eastAsia="Times New Roman"/>
+                <w:sz w:val="18"/>
               </w:rPr>
               <w:t>400</w:t>
             </w:r>
@@ -8110,8 +8163,9 @@
             <w:r>
               <w:rPr>
                 <w:rFonts w:ascii="Times New Roman" w:hAnsi="Times New Roman" w:eastAsia="Times New Roman"/>
-              </w:rPr>
-              <w:t>Validasi 400 lebih dulu</w:t>
+                <w:sz w:val="18"/>
+              </w:rPr>
+              <w:t>Field kosong, validasi dulu</w:t>
             </w:r>
           </w:p>
         </w:tc>
@@ -8142,6 +8196,7 @@
             <w:r>
               <w:rPr>
                 <w:rFonts w:ascii="Times New Roman" w:hAnsi="Times New Roman" w:eastAsia="Times New Roman"/>
+                <w:sz w:val="18"/>
               </w:rPr>
               <w:t>10</w:t>
             </w:r>
@@ -8169,6 +8224,7 @@
             <w:r>
               <w:rPr>
                 <w:rFonts w:ascii="Times New Roman" w:hAnsi="Times New Roman" w:eastAsia="Times New Roman"/>
+                <w:sz w:val="18"/>
               </w:rPr>
               <w:t>PUT</w:t>
             </w:r>
@@ -8198,6 +8254,7 @@
             <w:r>
               <w:rPr>
                 <w:rFonts w:ascii="Times New Roman" w:hAnsi="Times New Roman" w:eastAsia="Times New Roman"/>
+                <w:sz w:val="18"/>
               </w:rPr>
               <w:t>/smartphones/99</w:t>
             </w:r>
@@ -8225,6 +8282,7 @@
             <w:r>
               <w:rPr>
                 <w:rFonts w:ascii="Times New Roman" w:hAnsi="Times New Roman" w:eastAsia="Times New Roman"/>
+                <w:sz w:val="18"/>
               </w:rPr>
               <w:t>404</w:t>
             </w:r>
@@ -8252,6 +8310,7 @@
             <w:r>
               <w:rPr>
                 <w:rFonts w:ascii="Times New Roman" w:hAnsi="Times New Roman" w:eastAsia="Times New Roman"/>
+                <w:sz w:val="18"/>
               </w:rPr>
               <w:t>404</w:t>
             </w:r>
@@ -8281,6 +8340,7 @@
             <w:r>
               <w:rPr>
                 <w:rFonts w:ascii="Times New Roman" w:hAnsi="Times New Roman" w:eastAsia="Times New Roman"/>
+                <w:sz w:val="18"/>
               </w:rPr>
               <w:t>Body lengkap, id tidak ada</w:t>
             </w:r>
@@ -8313,6 +8373,7 @@
             <w:r>
               <w:rPr>
                 <w:rFonts w:ascii="Times New Roman" w:hAnsi="Times New Roman" w:eastAsia="Times New Roman"/>
+                <w:sz w:val="18"/>
               </w:rPr>
               <w:t>11</w:t>
             </w:r>
@@ -8340,6 +8401,7 @@
             <w:r>
               <w:rPr>
                 <w:rFonts w:ascii="Times New Roman" w:hAnsi="Times New Roman" w:eastAsia="Times New Roman"/>
+                <w:sz w:val="18"/>
               </w:rPr>
               <w:t>DELETE</w:t>
             </w:r>
@@ -8369,6 +8431,7 @@
             <w:r>
               <w:rPr>
                 <w:rFonts w:ascii="Times New Roman" w:hAnsi="Times New Roman" w:eastAsia="Times New Roman"/>
+                <w:sz w:val="18"/>
               </w:rPr>
               <w:t>/smartphones/1</w:t>
             </w:r>
@@ -8396,6 +8459,7 @@
             <w:r>
               <w:rPr>
                 <w:rFonts w:ascii="Times New Roman" w:hAnsi="Times New Roman" w:eastAsia="Times New Roman"/>
+                <w:sz w:val="18"/>
               </w:rPr>
               <w:t>200</w:t>
             </w:r>
@@ -8423,6 +8487,7 @@
             <w:r>
               <w:rPr>
                 <w:rFonts w:ascii="Times New Roman" w:hAnsi="Times New Roman" w:eastAsia="Times New Roman"/>
+                <w:sz w:val="18"/>
               </w:rPr>
               <w:t>200</w:t>
             </w:r>
@@ -8454,6 +8519,7 @@
             <w:r>
               <w:rPr>
                 <w:rFonts w:ascii="Times New Roman" w:hAnsi="Times New Roman" w:eastAsia="Times New Roman"/>
+                <w:sz w:val="18"/>
               </w:rPr>
               <w:t>data null, pesan menyebut id</w:t>
             </w:r>
@@ -8486,6 +8552,7 @@
             <w:r>
               <w:rPr>
                 <w:rFonts w:ascii="Times New Roman" w:hAnsi="Times New Roman" w:eastAsia="Times New Roman"/>
+                <w:sz w:val="18"/>
               </w:rPr>
               <w:t>12</w:t>
             </w:r>
@@ -8513,6 +8580,7 @@
             <w:r>
               <w:rPr>
                 <w:rFonts w:ascii="Times New Roman" w:hAnsi="Times New Roman" w:eastAsia="Times New Roman"/>
+                <w:sz w:val="18"/>
               </w:rPr>
               <w:t>DELETE</w:t>
             </w:r>
@@ -8542,6 +8610,7 @@
             <w:r>
               <w:rPr>
                 <w:rFonts w:ascii="Times New Roman" w:hAnsi="Times New Roman" w:eastAsia="Times New Roman"/>
+                <w:sz w:val="18"/>
               </w:rPr>
               <w:t>/smartphones/99</w:t>
             </w:r>
@@ -8569,6 +8638,7 @@
             <w:r>
               <w:rPr>
                 <w:rFonts w:ascii="Times New Roman" w:hAnsi="Times New Roman" w:eastAsia="Times New Roman"/>
+                <w:sz w:val="18"/>
               </w:rPr>
               <w:t>404</w:t>
             </w:r>
@@ -8596,6 +8666,7 @@
             <w:r>
               <w:rPr>
                 <w:rFonts w:ascii="Times New Roman" w:hAnsi="Times New Roman" w:eastAsia="Times New Roman"/>
+                <w:sz w:val="18"/>
               </w:rPr>
               <w:t>404</w:t>
             </w:r>
@@ -8625,6 +8696,7 @@
             <w:r>
               <w:rPr>
                 <w:rFonts w:ascii="Times New Roman" w:hAnsi="Times New Roman" w:eastAsia="Times New Roman"/>
+                <w:sz w:val="18"/>
               </w:rPr>
               <w:t>Data dengan id tidak ditemukan</w:t>
             </w:r>
@@ -8657,6 +8729,7 @@
             <w:r>
               <w:rPr>
                 <w:rFonts w:ascii="Times New Roman" w:hAnsi="Times New Roman" w:eastAsia="Times New Roman"/>
+                <w:sz w:val="18"/>
               </w:rPr>
               <w:t>13</w:t>
             </w:r>
@@ -8684,6 +8757,7 @@
             <w:r>
               <w:rPr>
                 <w:rFonts w:ascii="Times New Roman" w:hAnsi="Times New Roman" w:eastAsia="Times New Roman"/>
+                <w:sz w:val="18"/>
               </w:rPr>
               <w:t>GET</w:t>
             </w:r>
@@ -8711,6 +8785,7 @@
             <w:r>
               <w:rPr>
                 <w:rFonts w:ascii="Times New Roman" w:hAnsi="Times New Roman" w:eastAsia="Times New Roman"/>
+                <w:sz w:val="18"/>
               </w:rPr>
               <w:t>/gadget</w:t>
             </w:r>
@@ -8738,6 +8813,7 @@
             <w:r>
               <w:rPr>
                 <w:rFonts w:ascii="Times New Roman" w:hAnsi="Times New Roman" w:eastAsia="Times New Roman"/>
+                <w:sz w:val="18"/>
               </w:rPr>
               <w:t>404</w:t>
             </w:r>
@@ -8765,6 +8841,7 @@
             <w:r>
               <w:rPr>
                 <w:rFonts w:ascii="Times New Roman" w:hAnsi="Times New Roman" w:eastAsia="Times New Roman"/>
+                <w:sz w:val="18"/>
               </w:rPr>
               <w:t>404</w:t>
             </w:r>
@@ -8796,6 +8873,7 @@
             <w:r>
               <w:rPr>
                 <w:rFonts w:ascii="Times New Roman" w:hAnsi="Times New Roman" w:eastAsia="Times New Roman"/>
+                <w:sz w:val="18"/>
               </w:rPr>
               <w:t>Catch-all handler, bukan HTML</w:t>
             </w:r>
@@ -8811,6 +8889,7 @@
             <w:r>
               <w:rPr>
                 <w:rFonts w:ascii="Times New Roman" w:hAnsi="Times New Roman" w:eastAsia="Times New Roman"/>
+                <w:sz w:val="18"/>
               </w:rPr>
               <w:t>14</w:t>
             </w:r>
@@ -8824,6 +8903,7 @@
             <w:r>
               <w:rPr>
                 <w:rFonts w:ascii="Times New Roman" w:hAnsi="Times New Roman" w:eastAsia="Times New Roman"/>
+                <w:sz w:val="18"/>
               </w:rPr>
               <w:t>GET</w:t>
             </w:r>
@@ -8837,6 +8917,7 @@
             <w:r>
               <w:rPr>
                 <w:rFonts w:ascii="Times New Roman" w:hAnsi="Times New Roman" w:eastAsia="Times New Roman"/>
+                <w:sz w:val="18"/>
               </w:rPr>
               <w:t>/</w:t>
             </w:r>
@@ -8850,6 +8931,7 @@
             <w:r>
               <w:rPr>
                 <w:rFonts w:ascii="Times New Roman" w:hAnsi="Times New Roman" w:eastAsia="Times New Roman"/>
+                <w:sz w:val="18"/>
               </w:rPr>
               <w:t>200</w:t>
             </w:r>
@@ -8863,6 +8945,7 @@
             <w:r>
               <w:rPr>
                 <w:rFonts w:ascii="Times New Roman" w:hAnsi="Times New Roman" w:eastAsia="Times New Roman"/>
+                <w:sz w:val="18"/>
               </w:rPr>
               <w:t>200</w:t>
             </w:r>
@@ -8876,6 +8959,7 @@
             <w:r>
               <w:rPr>
                 <w:rFonts w:ascii="Times New Roman" w:hAnsi="Times New Roman" w:eastAsia="Times New Roman"/>
+                <w:sz w:val="18"/>
               </w:rPr>
               <w:t>Informasi API</w:t>
             </w:r>

</xml_diff>